<commit_message>
Tema 6: revisa la teoría y la Actividad 6.1 de infraestructura como código
Reescribe la teoría de infraestructura como código con la infografía de
los tres mundos, añade el identificador a los recursos del módulo
Terraform y reorganiza la Actividad 6.1 (Parte A 6 puntos, Parte B 4).
Añade las diapositivas del apartado, la plantilla del alumno y el zip de
recursos actualizados.
</commit_message>
<xml_diff>
--- a/docs/tema6/plantillas/Actividad_6_1_INU_Plantilla.docx
+++ b/docs/tema6/plantillas/Actividad_6_1_INU_Plantilla.docx
@@ -167,7 +167,7 @@
                 <w:sz w:val="20"/>
                 <w:szCs w:val="20"/>
               </w:rPr>
-              <w:t xml:space="preserve">Identificador de recursos usado (si aplica): _______________________________</w:t>
+              <w:t xml:space="preserve">Identificador de recursos (el tuyo): ______________________________________________</w:t>
             </w:r>
           </w:p>
         </w:tc>
@@ -198,7 +198,7 @@
           <w:sz w:val="26"/>
           <w:szCs w:val="26"/>
         </w:rPr>
-        <w:t xml:space="preserve">Parte A — Lee, modifica y aplica con plan</w:t>
+        <w:t xml:space="preserve">Parte A — Lee, modifica y comprueba qué ve Terraform</w:t>
       </w:r>
     </w:p>
     <w:p>
@@ -236,7 +236,7 @@
           <w:sz w:val="22"/>
           <w:szCs w:val="22"/>
         </w:rPr>
-        <w:t xml:space="preserve">Descripción, en tus propias palabras, de la infraestructura completa que describe el módulo (recursos, variables y salidas), sin haberlo ejecutado.</w:t>
+        <w:t xml:space="preserve">Cuántos recursos crees que va a crear terraform apply, antes de ejecutar nada:</w:t>
       </w:r>
     </w:p>
     <w:tbl>
@@ -318,107 +318,25 @@
           </w:p>
         </w:tc>
       </w:tr>
-      <w:tr>
-        <w:trPr>
-          <w:trHeight w:val="480"/>
-        </w:trPr>
-        <w:tc>
-          <w:tcPr>
-            <w:tcW w:type="dxa" w:w="9638"/>
-            <w:tcBorders>
-              <w:top w:val="single" w:color="E0E0E0" w:sz="4"/>
-              <w:left w:val="single" w:color="E0E0E0" w:sz="4"/>
-              <w:bottom w:val="single" w:color="E0E0E0" w:sz="4"/>
-              <w:right w:val="single" w:color="E0E0E0" w:sz="4"/>
-            </w:tcBorders>
-            <w:shd w:fill="FAFAFA" w:val="clear"/>
-            <w:tcMar>
-              <w:top w:type="dxa" w:w="60"/>
-              <w:left w:type="dxa" w:w="160"/>
-              <w:bottom w:type="dxa" w:w="60"/>
-              <w:right w:type="dxa" w:w="160"/>
-            </w:tcMar>
-          </w:tcPr>
-          <w:p>
-            <w:r>
-              <w:rPr>
-                <w:sz w:val="22"/>
-                <w:szCs w:val="22"/>
-              </w:rPr>
-              <w:t xml:space="preserve"/>
-            </w:r>
-          </w:p>
-        </w:tc>
-      </w:tr>
-      <w:tr>
-        <w:trPr>
-          <w:trHeight w:val="480"/>
-        </w:trPr>
-        <w:tc>
-          <w:tcPr>
-            <w:tcW w:type="dxa" w:w="9638"/>
-            <w:tcBorders>
-              <w:top w:val="single" w:color="E0E0E0" w:sz="4"/>
-              <w:left w:val="single" w:color="E0E0E0" w:sz="4"/>
-              <w:bottom w:val="single" w:color="E0E0E0" w:sz="4"/>
-              <w:right w:val="single" w:color="E0E0E0" w:sz="4"/>
-            </w:tcBorders>
-            <w:shd w:fill="FAFAFA" w:val="clear"/>
-            <w:tcMar>
-              <w:top w:type="dxa" w:w="60"/>
-              <w:left w:type="dxa" w:w="160"/>
-              <w:bottom w:type="dxa" w:w="60"/>
-              <w:right w:type="dxa" w:w="160"/>
-            </w:tcMar>
-          </w:tcPr>
-          <w:p>
-            <w:r>
-              <w:rPr>
-                <w:sz w:val="22"/>
-                <w:szCs w:val="22"/>
-              </w:rPr>
-              <w:t xml:space="preserve"/>
-            </w:r>
-          </w:p>
-        </w:tc>
-      </w:tr>
-      <w:tr>
-        <w:trPr>
-          <w:trHeight w:val="480"/>
-        </w:trPr>
-        <w:tc>
-          <w:tcPr>
-            <w:tcW w:type="dxa" w:w="9638"/>
-            <w:tcBorders>
-              <w:top w:val="single" w:color="E0E0E0" w:sz="4"/>
-              <w:left w:val="single" w:color="E0E0E0" w:sz="4"/>
-              <w:bottom w:val="single" w:color="E0E0E0" w:sz="4"/>
-              <w:right w:val="single" w:color="E0E0E0" w:sz="4"/>
-            </w:tcBorders>
-            <w:shd w:fill="FAFAFA" w:val="clear"/>
-            <w:tcMar>
-              <w:top w:type="dxa" w:w="60"/>
-              <w:left w:type="dxa" w:w="160"/>
-              <w:bottom w:type="dxa" w:w="60"/>
-              <w:right w:type="dxa" w:w="160"/>
-            </w:tcMar>
-          </w:tcPr>
-          <w:p>
-            <w:r>
-              <w:rPr>
-                <w:sz w:val="22"/>
-                <w:szCs w:val="22"/>
-              </w:rPr>
-              <w:t xml:space="preserve"/>
-            </w:r>
-          </w:p>
-        </w:tc>
-      </w:tr>
     </w:tbl>
     <w:p>
       <w:pPr>
         <w:spacing w:after="120"/>
       </w:pPr>
+    </w:p>
+    <w:p>
+      <w:pPr>
+        <w:spacing w:after="100"/>
+      </w:pPr>
+      <w:r>
+        <w:rPr>
+          <w:rFonts w:ascii="Arial" w:cs="Arial" w:eastAsia="Arial" w:hAnsi="Arial"/>
+          <w:color w:val="212121"/>
+          <w:sz w:val="22"/>
+          <w:szCs w:val="22"/>
+        </w:rPr>
+        <w:t xml:space="preserve">Descripción, en tus propias palabras, de la infraestructura completa que describe el módulo (recursos, variables y salidas):</w:t>
+      </w:r>
     </w:p>
     <w:tbl>
       <w:tblPr>
@@ -436,73 +354,161 @@
         <w:gridCol w:w="9638"/>
       </w:tblGrid>
       <w:tr>
-        <w:tc>
-          <w:tcPr>
-            <w:tcW w:type="dxa" w:w="9638"/>
-            <w:tcBorders>
-              <w:top w:val="none" w:color="FFFFFF" w:sz="0"/>
-              <w:left w:val="none" w:color="FFFFFF" w:sz="0"/>
-              <w:bottom w:val="none" w:color="FFFFFF" w:sz="0"/>
-              <w:right w:val="none" w:color="FFFFFF" w:sz="0"/>
-            </w:tcBorders>
-            <w:shd w:fill="3949AB" w:val="clear"/>
-            <w:tcMar>
-              <w:top w:type="dxa" w:w="80"/>
-              <w:left w:type="dxa" w:w="160"/>
-              <w:bottom w:type="dxa" w:w="80"/>
-              <w:right w:type="dxa" w:w="160"/>
-            </w:tcMar>
-          </w:tcPr>
-          <w:p>
-            <w:r>
-              <w:rPr>
-                <w:rFonts w:ascii="Arial" w:cs="Arial" w:eastAsia="Arial" w:hAnsi="Arial"/>
-                <w:b/>
-                <w:bCs/>
-                <w:color w:val="FFFFFF"/>
-                <w:sz w:val="20"/>
-                <w:szCs w:val="20"/>
-              </w:rPr>
-              <w:t xml:space="preserve">📸 El fichero .tf con los recursos señalados</w:t>
-            </w:r>
-          </w:p>
-        </w:tc>
-      </w:tr>
-      <w:tr>
-        <w:trPr>
-          <w:trHeight w:val="2400"/>
-        </w:trPr>
-        <w:tc>
-          <w:tcPr>
-            <w:tcW w:type="dxa" w:w="9638"/>
-            <w:tcBorders>
-              <w:top w:val="single" w:color="E0E0E0" w:sz="4"/>
-              <w:left w:val="single" w:color="E0E0E0" w:sz="4"/>
-              <w:bottom w:val="single" w:color="E0E0E0" w:sz="4"/>
-              <w:right w:val="single" w:color="E0E0E0" w:sz="4"/>
-            </w:tcBorders>
-            <w:shd w:fill="FAFAFA" w:val="clear"/>
-            <w:tcMar>
-              <w:top w:type="dxa" w:w="80"/>
-              <w:left w:type="dxa" w:w="160"/>
-              <w:bottom w:type="dxa" w:w="80"/>
-              <w:right w:type="dxa" w:w="160"/>
-            </w:tcMar>
-          </w:tcPr>
-          <w:p>
-            <w:pPr>
-              <w:jc w:val="center"/>
-            </w:pPr>
-            <w:r>
-              <w:rPr>
-                <w:rFonts w:ascii="Arial" w:cs="Arial" w:eastAsia="Arial" w:hAnsi="Arial"/>
-                <w:i/>
-                <w:iCs/>
-                <w:color w:val="757575"/>
-                <w:sz w:val="20"/>
-                <w:szCs w:val="20"/>
-              </w:rPr>
-              <w:t xml:space="preserve">[Pega aquí la captura de pantalla]</w:t>
+        <w:trPr>
+          <w:trHeight w:val="480"/>
+        </w:trPr>
+        <w:tc>
+          <w:tcPr>
+            <w:tcW w:type="dxa" w:w="9638"/>
+            <w:tcBorders>
+              <w:top w:val="single" w:color="E0E0E0" w:sz="4"/>
+              <w:left w:val="single" w:color="E0E0E0" w:sz="4"/>
+              <w:bottom w:val="single" w:color="E0E0E0" w:sz="4"/>
+              <w:right w:val="single" w:color="E0E0E0" w:sz="4"/>
+            </w:tcBorders>
+            <w:shd w:fill="FAFAFA" w:val="clear"/>
+            <w:tcMar>
+              <w:top w:type="dxa" w:w="60"/>
+              <w:left w:type="dxa" w:w="160"/>
+              <w:bottom w:type="dxa" w:w="60"/>
+              <w:right w:type="dxa" w:w="160"/>
+            </w:tcMar>
+          </w:tcPr>
+          <w:p>
+            <w:r>
+              <w:rPr>
+                <w:sz w:val="22"/>
+                <w:szCs w:val="22"/>
+              </w:rPr>
+              <w:t xml:space="preserve"/>
+            </w:r>
+          </w:p>
+        </w:tc>
+      </w:tr>
+      <w:tr>
+        <w:trPr>
+          <w:trHeight w:val="480"/>
+        </w:trPr>
+        <w:tc>
+          <w:tcPr>
+            <w:tcW w:type="dxa" w:w="9638"/>
+            <w:tcBorders>
+              <w:top w:val="single" w:color="E0E0E0" w:sz="4"/>
+              <w:left w:val="single" w:color="E0E0E0" w:sz="4"/>
+              <w:bottom w:val="single" w:color="E0E0E0" w:sz="4"/>
+              <w:right w:val="single" w:color="E0E0E0" w:sz="4"/>
+            </w:tcBorders>
+            <w:shd w:fill="FAFAFA" w:val="clear"/>
+            <w:tcMar>
+              <w:top w:type="dxa" w:w="60"/>
+              <w:left w:type="dxa" w:w="160"/>
+              <w:bottom w:type="dxa" w:w="60"/>
+              <w:right w:type="dxa" w:w="160"/>
+            </w:tcMar>
+          </w:tcPr>
+          <w:p>
+            <w:r>
+              <w:rPr>
+                <w:sz w:val="22"/>
+                <w:szCs w:val="22"/>
+              </w:rPr>
+              <w:t xml:space="preserve"/>
+            </w:r>
+          </w:p>
+        </w:tc>
+      </w:tr>
+      <w:tr>
+        <w:trPr>
+          <w:trHeight w:val="480"/>
+        </w:trPr>
+        <w:tc>
+          <w:tcPr>
+            <w:tcW w:type="dxa" w:w="9638"/>
+            <w:tcBorders>
+              <w:top w:val="single" w:color="E0E0E0" w:sz="4"/>
+              <w:left w:val="single" w:color="E0E0E0" w:sz="4"/>
+              <w:bottom w:val="single" w:color="E0E0E0" w:sz="4"/>
+              <w:right w:val="single" w:color="E0E0E0" w:sz="4"/>
+            </w:tcBorders>
+            <w:shd w:fill="FAFAFA" w:val="clear"/>
+            <w:tcMar>
+              <w:top w:type="dxa" w:w="60"/>
+              <w:left w:type="dxa" w:w="160"/>
+              <w:bottom w:type="dxa" w:w="60"/>
+              <w:right w:type="dxa" w:w="160"/>
+            </w:tcMar>
+          </w:tcPr>
+          <w:p>
+            <w:r>
+              <w:rPr>
+                <w:sz w:val="22"/>
+                <w:szCs w:val="22"/>
+              </w:rPr>
+              <w:t xml:space="preserve"/>
+            </w:r>
+          </w:p>
+        </w:tc>
+      </w:tr>
+      <w:tr>
+        <w:trPr>
+          <w:trHeight w:val="480"/>
+        </w:trPr>
+        <w:tc>
+          <w:tcPr>
+            <w:tcW w:type="dxa" w:w="9638"/>
+            <w:tcBorders>
+              <w:top w:val="single" w:color="E0E0E0" w:sz="4"/>
+              <w:left w:val="single" w:color="E0E0E0" w:sz="4"/>
+              <w:bottom w:val="single" w:color="E0E0E0" w:sz="4"/>
+              <w:right w:val="single" w:color="E0E0E0" w:sz="4"/>
+            </w:tcBorders>
+            <w:shd w:fill="FAFAFA" w:val="clear"/>
+            <w:tcMar>
+              <w:top w:type="dxa" w:w="60"/>
+              <w:left w:type="dxa" w:w="160"/>
+              <w:bottom w:type="dxa" w:w="60"/>
+              <w:right w:type="dxa" w:w="160"/>
+            </w:tcMar>
+          </w:tcPr>
+          <w:p>
+            <w:r>
+              <w:rPr>
+                <w:sz w:val="22"/>
+                <w:szCs w:val="22"/>
+              </w:rPr>
+              <w:t xml:space="preserve"/>
+            </w:r>
+          </w:p>
+        </w:tc>
+      </w:tr>
+      <w:tr>
+        <w:trPr>
+          <w:trHeight w:val="480"/>
+        </w:trPr>
+        <w:tc>
+          <w:tcPr>
+            <w:tcW w:type="dxa" w:w="9638"/>
+            <w:tcBorders>
+              <w:top w:val="single" w:color="E0E0E0" w:sz="4"/>
+              <w:left w:val="single" w:color="E0E0E0" w:sz="4"/>
+              <w:bottom w:val="single" w:color="E0E0E0" w:sz="4"/>
+              <w:right w:val="single" w:color="E0E0E0" w:sz="4"/>
+            </w:tcBorders>
+            <w:shd w:fill="FAFAFA" w:val="clear"/>
+            <w:tcMar>
+              <w:top w:type="dxa" w:w="60"/>
+              <w:left w:type="dxa" w:w="160"/>
+              <w:bottom w:type="dxa" w:w="60"/>
+              <w:right w:type="dxa" w:w="160"/>
+            </w:tcMar>
+          </w:tcPr>
+          <w:p>
+            <w:r>
+              <w:rPr>
+                <w:sz w:val="22"/>
+                <w:szCs w:val="22"/>
+              </w:rPr>
+              <w:t xml:space="preserve"/>
             </w:r>
           </w:p>
         </w:tc>
@@ -510,32 +516,8 @@
     </w:tbl>
     <w:p>
       <w:pPr>
-        <w:spacing w:after="200"/>
-      </w:pPr>
-    </w:p>
-    <w:p>
-      <w:r>
-        <w:br w:type="page"/>
-      </w:r>
-    </w:p>
-    <w:p>
-      <w:pPr>
-        <w:pBdr>
-          <w:bottom w:val="single" w:color="FFA000" w:sz="4" w:space="1"/>
-        </w:pBdr>
-        <w:spacing w:after="120" w:before="240"/>
-      </w:pPr>
-      <w:r>
-        <w:rPr>
-          <w:rFonts w:ascii="Arial" w:cs="Arial" w:eastAsia="Arial" w:hAnsi="Arial"/>
-          <w:b/>
-          <w:bCs/>
-          <w:color w:val="3949AB"/>
-          <w:sz w:val="24"/>
-          <w:szCs w:val="24"/>
-        </w:rPr>
-        <w:t xml:space="preserve">Paso 2 — Inicializa y aplica por primera vez</w:t>
-      </w:r>
+        <w:spacing w:after="120"/>
+      </w:pPr>
     </w:p>
     <w:tbl>
       <w:tblPr>
@@ -580,7 +562,7 @@
                 <w:sz w:val="20"/>
                 <w:szCs w:val="20"/>
               </w:rPr>
-              <w:t xml:space="preserve">📸 Salida de terraform apply con el resumen final, y la VPC/subredes visibles en la consola de AWS</w:t>
+              <w:t xml:space="preserve">📸 El fichero main.tf con el nombre de cada bloque resource rodeado o subrayado</w:t>
             </w:r>
           </w:p>
         </w:tc>
@@ -629,6 +611,11 @@
       <w:pPr>
         <w:spacing w:after="200"/>
       </w:pPr>
+    </w:p>
+    <w:p>
+      <w:r>
+        <w:br w:type="page"/>
+      </w:r>
     </w:p>
     <w:p>
       <w:pPr>
@@ -646,7 +633,7 @@
           <w:sz w:val="24"/>
           <w:szCs w:val="24"/>
         </w:rPr>
-        <w:t xml:space="preserve">Paso 3 — Modifica el módulo para añadir una subred</w:t>
+        <w:t xml:space="preserve">Paso 2 — Inicializa y aplica por primera vez</w:t>
       </w:r>
     </w:p>
     <w:tbl>
@@ -692,7 +679,7 @@
                 <w:sz w:val="20"/>
                 <w:szCs w:val="20"/>
               </w:rPr>
-              <w:t xml:space="preserve">📸 El plan mostrando solo la creación añadida, y la subred nueva visible en consola</w:t>
+              <w:t xml:space="preserve">📸 Salida de terraform apply con el resumen final, y la VPC/subredes visibles en la consola de AWS</w:t>
             </w:r>
           </w:p>
         </w:tc>
@@ -739,7 +726,7 @@
     </w:tbl>
     <w:p>
       <w:pPr>
-        <w:spacing w:after="160"/>
+        <w:spacing w:after="200"/>
       </w:pPr>
     </w:p>
     <w:p>
@@ -758,21 +745,7 @@
           <w:sz w:val="24"/>
           <w:szCs w:val="24"/>
         </w:rPr>
-        <w:t xml:space="preserve">Reflexiona</w:t>
-      </w:r>
-    </w:p>
-    <w:p>
-      <w:pPr>
-        <w:spacing w:after="100"/>
-      </w:pPr>
-      <w:r>
-        <w:rPr>
-          <w:rFonts w:ascii="Arial" w:cs="Arial" w:eastAsia="Arial" w:hAnsi="Arial"/>
-          <w:color w:val="212121"/>
-          <w:sz w:val="22"/>
-          <w:szCs w:val="22"/>
-        </w:rPr>
-        <w:t xml:space="preserve">Si dentro de tres meses alguien pregunta por qué existe esa subred nueva, ¿qué respuesta te da el código (con su commit) que nunca te habría dado la consola?</w:t>
+        <w:t xml:space="preserve">Paso 3 — Modifica el módulo para añadir una subred</w:t>
       </w:r>
     </w:p>
     <w:tbl>
@@ -791,129 +764,73 @@
         <w:gridCol w:w="9638"/>
       </w:tblGrid>
       <w:tr>
-        <w:trPr>
-          <w:trHeight w:val="480"/>
-        </w:trPr>
-        <w:tc>
-          <w:tcPr>
-            <w:tcW w:type="dxa" w:w="9638"/>
-            <w:tcBorders>
-              <w:top w:val="single" w:color="E0E0E0" w:sz="4"/>
-              <w:left w:val="single" w:color="E0E0E0" w:sz="4"/>
-              <w:bottom w:val="single" w:color="E0E0E0" w:sz="4"/>
-              <w:right w:val="single" w:color="E0E0E0" w:sz="4"/>
-            </w:tcBorders>
-            <w:shd w:fill="FAFAFA" w:val="clear"/>
-            <w:tcMar>
-              <w:top w:type="dxa" w:w="60"/>
-              <w:left w:type="dxa" w:w="160"/>
-              <w:bottom w:type="dxa" w:w="60"/>
-              <w:right w:type="dxa" w:w="160"/>
-            </w:tcMar>
-          </w:tcPr>
-          <w:p>
-            <w:r>
-              <w:rPr>
-                <w:sz w:val="22"/>
-                <w:szCs w:val="22"/>
-              </w:rPr>
-              <w:t xml:space="preserve"/>
-            </w:r>
-          </w:p>
-        </w:tc>
-      </w:tr>
-      <w:tr>
-        <w:trPr>
-          <w:trHeight w:val="480"/>
-        </w:trPr>
-        <w:tc>
-          <w:tcPr>
-            <w:tcW w:type="dxa" w:w="9638"/>
-            <w:tcBorders>
-              <w:top w:val="single" w:color="E0E0E0" w:sz="4"/>
-              <w:left w:val="single" w:color="E0E0E0" w:sz="4"/>
-              <w:bottom w:val="single" w:color="E0E0E0" w:sz="4"/>
-              <w:right w:val="single" w:color="E0E0E0" w:sz="4"/>
-            </w:tcBorders>
-            <w:shd w:fill="FAFAFA" w:val="clear"/>
-            <w:tcMar>
-              <w:top w:type="dxa" w:w="60"/>
-              <w:left w:type="dxa" w:w="160"/>
-              <w:bottom w:type="dxa" w:w="60"/>
-              <w:right w:type="dxa" w:w="160"/>
-            </w:tcMar>
-          </w:tcPr>
-          <w:p>
-            <w:r>
-              <w:rPr>
-                <w:sz w:val="22"/>
-                <w:szCs w:val="22"/>
-              </w:rPr>
-              <w:t xml:space="preserve"/>
-            </w:r>
-          </w:p>
-        </w:tc>
-      </w:tr>
-      <w:tr>
-        <w:trPr>
-          <w:trHeight w:val="480"/>
-        </w:trPr>
-        <w:tc>
-          <w:tcPr>
-            <w:tcW w:type="dxa" w:w="9638"/>
-            <w:tcBorders>
-              <w:top w:val="single" w:color="E0E0E0" w:sz="4"/>
-              <w:left w:val="single" w:color="E0E0E0" w:sz="4"/>
-              <w:bottom w:val="single" w:color="E0E0E0" w:sz="4"/>
-              <w:right w:val="single" w:color="E0E0E0" w:sz="4"/>
-            </w:tcBorders>
-            <w:shd w:fill="FAFAFA" w:val="clear"/>
-            <w:tcMar>
-              <w:top w:type="dxa" w:w="60"/>
-              <w:left w:type="dxa" w:w="160"/>
-              <w:bottom w:type="dxa" w:w="60"/>
-              <w:right w:type="dxa" w:w="160"/>
-            </w:tcMar>
-          </w:tcPr>
-          <w:p>
-            <w:r>
-              <w:rPr>
-                <w:sz w:val="22"/>
-                <w:szCs w:val="22"/>
-              </w:rPr>
-              <w:t xml:space="preserve"/>
-            </w:r>
-          </w:p>
-        </w:tc>
-      </w:tr>
-      <w:tr>
-        <w:trPr>
-          <w:trHeight w:val="480"/>
-        </w:trPr>
-        <w:tc>
-          <w:tcPr>
-            <w:tcW w:type="dxa" w:w="9638"/>
-            <w:tcBorders>
-              <w:top w:val="single" w:color="E0E0E0" w:sz="4"/>
-              <w:left w:val="single" w:color="E0E0E0" w:sz="4"/>
-              <w:bottom w:val="single" w:color="E0E0E0" w:sz="4"/>
-              <w:right w:val="single" w:color="E0E0E0" w:sz="4"/>
-            </w:tcBorders>
-            <w:shd w:fill="FAFAFA" w:val="clear"/>
-            <w:tcMar>
-              <w:top w:type="dxa" w:w="60"/>
-              <w:left w:type="dxa" w:w="160"/>
-              <w:bottom w:type="dxa" w:w="60"/>
-              <w:right w:type="dxa" w:w="160"/>
-            </w:tcMar>
-          </w:tcPr>
-          <w:p>
-            <w:r>
-              <w:rPr>
-                <w:sz w:val="22"/>
-                <w:szCs w:val="22"/>
-              </w:rPr>
-              <w:t xml:space="preserve"/>
+        <w:tc>
+          <w:tcPr>
+            <w:tcW w:type="dxa" w:w="9638"/>
+            <w:tcBorders>
+              <w:top w:val="none" w:color="FFFFFF" w:sz="0"/>
+              <w:left w:val="none" w:color="FFFFFF" w:sz="0"/>
+              <w:bottom w:val="none" w:color="FFFFFF" w:sz="0"/>
+              <w:right w:val="none" w:color="FFFFFF" w:sz="0"/>
+            </w:tcBorders>
+            <w:shd w:fill="3949AB" w:val="clear"/>
+            <w:tcMar>
+              <w:top w:type="dxa" w:w="80"/>
+              <w:left w:type="dxa" w:w="160"/>
+              <w:bottom w:type="dxa" w:w="80"/>
+              <w:right w:type="dxa" w:w="160"/>
+            </w:tcMar>
+          </w:tcPr>
+          <w:p>
+            <w:r>
+              <w:rPr>
+                <w:rFonts w:ascii="Arial" w:cs="Arial" w:eastAsia="Arial" w:hAnsi="Arial"/>
+                <w:b/>
+                <w:bCs/>
+                <w:color w:val="FFFFFF"/>
+                <w:sz w:val="20"/>
+                <w:szCs w:val="20"/>
+              </w:rPr>
+              <w:t xml:space="preserve">📸 El plan mostrando solo la creación añadida, y la subred nueva visible en consola</w:t>
+            </w:r>
+          </w:p>
+        </w:tc>
+      </w:tr>
+      <w:tr>
+        <w:trPr>
+          <w:trHeight w:val="2400"/>
+        </w:trPr>
+        <w:tc>
+          <w:tcPr>
+            <w:tcW w:type="dxa" w:w="9638"/>
+            <w:tcBorders>
+              <w:top w:val="single" w:color="E0E0E0" w:sz="4"/>
+              <w:left w:val="single" w:color="E0E0E0" w:sz="4"/>
+              <w:bottom w:val="single" w:color="E0E0E0" w:sz="4"/>
+              <w:right w:val="single" w:color="E0E0E0" w:sz="4"/>
+            </w:tcBorders>
+            <w:shd w:fill="FAFAFA" w:val="clear"/>
+            <w:tcMar>
+              <w:top w:type="dxa" w:w="80"/>
+              <w:left w:type="dxa" w:w="160"/>
+              <w:bottom w:type="dxa" w:w="80"/>
+              <w:right w:type="dxa" w:w="160"/>
+            </w:tcMar>
+          </w:tcPr>
+          <w:p>
+            <w:pPr>
+              <w:jc w:val="center"/>
+            </w:pPr>
+            <w:r>
+              <w:rPr>
+                <w:rFonts w:ascii="Arial" w:cs="Arial" w:eastAsia="Arial" w:hAnsi="Arial"/>
+                <w:i/>
+                <w:iCs/>
+                <w:color w:val="757575"/>
+                <w:sz w:val="20"/>
+                <w:szCs w:val="20"/>
+              </w:rPr>
+              <w:t xml:space="preserve">[Pega aquí la captura de pantalla]</w:t>
             </w:r>
           </w:p>
         </w:tc>
@@ -921,35 +838,7 @@
     </w:tbl>
     <w:p>
       <w:pPr>
-        <w:spacing w:after="200"/>
-      </w:pPr>
-    </w:p>
-    <w:p>
-      <w:r>
-        <w:br w:type="page"/>
-      </w:r>
-    </w:p>
-    <w:p>
-      <w:pPr>
-        <w:shd w:fill="3949AB" w:val="clear"/>
-        <w:spacing w:after="0" w:before="320"/>
-        <w:ind w:left="200" w:right="200"/>
-      </w:pPr>
-      <w:r>
-        <w:rPr>
-          <w:rFonts w:ascii="Arial" w:cs="Arial" w:eastAsia="Arial" w:hAnsi="Arial"/>
-          <w:b/>
-          <w:bCs/>
-          <w:color w:val="FFFFFF"/>
-          <w:sz w:val="26"/>
-          <w:szCs w:val="26"/>
-        </w:rPr>
-        <w:t xml:space="preserve">Parte B — Reto: parametriza, despliega dos entornos y cronometra</w:t>
-      </w:r>
-    </w:p>
-    <w:p>
-      <w:pPr>
-        <w:spacing w:after="120"/>
+        <w:spacing w:after="160"/>
       </w:pPr>
     </w:p>
     <w:p>
@@ -968,7 +857,21 @@
           <w:sz w:val="24"/>
           <w:szCs w:val="24"/>
         </w:rPr>
-        <w:t xml:space="preserve">Parametriza el módulo</w:t>
+        <w:t xml:space="preserve">Reflexiona (Paso 3)</w:t>
+      </w:r>
+    </w:p>
+    <w:p>
+      <w:pPr>
+        <w:spacing w:after="100"/>
+      </w:pPr>
+      <w:r>
+        <w:rPr>
+          <w:rFonts w:ascii="Arial" w:cs="Arial" w:eastAsia="Arial" w:hAnsi="Arial"/>
+          <w:color w:val="212121"/>
+          <w:sz w:val="22"/>
+          <w:szCs w:val="22"/>
+        </w:rPr>
+        <w:t xml:space="preserve">Si dentro de tres meses alguien pregunta por qué existe esa subred nueva, ¿qué respuesta te da el código (con su commit) que nunca te habría dado la consola?</w:t>
       </w:r>
     </w:p>
     <w:tbl>
@@ -987,73 +890,129 @@
         <w:gridCol w:w="9638"/>
       </w:tblGrid>
       <w:tr>
-        <w:tc>
-          <w:tcPr>
-            <w:tcW w:type="dxa" w:w="9638"/>
-            <w:tcBorders>
-              <w:top w:val="none" w:color="FFFFFF" w:sz="0"/>
-              <w:left w:val="none" w:color="FFFFFF" w:sz="0"/>
-              <w:bottom w:val="none" w:color="FFFFFF" w:sz="0"/>
-              <w:right w:val="none" w:color="FFFFFF" w:sz="0"/>
-            </w:tcBorders>
-            <w:shd w:fill="3949AB" w:val="clear"/>
-            <w:tcMar>
-              <w:top w:type="dxa" w:w="80"/>
-              <w:left w:type="dxa" w:w="160"/>
-              <w:bottom w:type="dxa" w:w="80"/>
-              <w:right w:type="dxa" w:w="160"/>
-            </w:tcMar>
-          </w:tcPr>
-          <w:p>
-            <w:r>
-              <w:rPr>
-                <w:rFonts w:ascii="Arial" w:cs="Arial" w:eastAsia="Arial" w:hAnsi="Arial"/>
-                <w:b/>
-                <w:bCs/>
-                <w:color w:val="FFFFFF"/>
-                <w:sz w:val="20"/>
-                <w:szCs w:val="20"/>
-              </w:rPr>
-              <w:t xml:space="preserve">📸 El código parametrizado (entorno, rango de red y tipo de instancia como variables)</w:t>
-            </w:r>
-          </w:p>
-        </w:tc>
-      </w:tr>
-      <w:tr>
-        <w:trPr>
-          <w:trHeight w:val="2400"/>
-        </w:trPr>
-        <w:tc>
-          <w:tcPr>
-            <w:tcW w:type="dxa" w:w="9638"/>
-            <w:tcBorders>
-              <w:top w:val="single" w:color="E0E0E0" w:sz="4"/>
-              <w:left w:val="single" w:color="E0E0E0" w:sz="4"/>
-              <w:bottom w:val="single" w:color="E0E0E0" w:sz="4"/>
-              <w:right w:val="single" w:color="E0E0E0" w:sz="4"/>
-            </w:tcBorders>
-            <w:shd w:fill="FAFAFA" w:val="clear"/>
-            <w:tcMar>
-              <w:top w:type="dxa" w:w="80"/>
-              <w:left w:type="dxa" w:w="160"/>
-              <w:bottom w:type="dxa" w:w="80"/>
-              <w:right w:type="dxa" w:w="160"/>
-            </w:tcMar>
-          </w:tcPr>
-          <w:p>
-            <w:pPr>
-              <w:jc w:val="center"/>
-            </w:pPr>
-            <w:r>
-              <w:rPr>
-                <w:rFonts w:ascii="Arial" w:cs="Arial" w:eastAsia="Arial" w:hAnsi="Arial"/>
-                <w:i/>
-                <w:iCs/>
-                <w:color w:val="757575"/>
-                <w:sz w:val="20"/>
-                <w:szCs w:val="20"/>
-              </w:rPr>
-              <w:t xml:space="preserve">[Pega aquí la captura de pantalla]</w:t>
+        <w:trPr>
+          <w:trHeight w:val="480"/>
+        </w:trPr>
+        <w:tc>
+          <w:tcPr>
+            <w:tcW w:type="dxa" w:w="9638"/>
+            <w:tcBorders>
+              <w:top w:val="single" w:color="E0E0E0" w:sz="4"/>
+              <w:left w:val="single" w:color="E0E0E0" w:sz="4"/>
+              <w:bottom w:val="single" w:color="E0E0E0" w:sz="4"/>
+              <w:right w:val="single" w:color="E0E0E0" w:sz="4"/>
+            </w:tcBorders>
+            <w:shd w:fill="FAFAFA" w:val="clear"/>
+            <w:tcMar>
+              <w:top w:type="dxa" w:w="60"/>
+              <w:left w:type="dxa" w:w="160"/>
+              <w:bottom w:type="dxa" w:w="60"/>
+              <w:right w:type="dxa" w:w="160"/>
+            </w:tcMar>
+          </w:tcPr>
+          <w:p>
+            <w:r>
+              <w:rPr>
+                <w:sz w:val="22"/>
+                <w:szCs w:val="22"/>
+              </w:rPr>
+              <w:t xml:space="preserve"/>
+            </w:r>
+          </w:p>
+        </w:tc>
+      </w:tr>
+      <w:tr>
+        <w:trPr>
+          <w:trHeight w:val="480"/>
+        </w:trPr>
+        <w:tc>
+          <w:tcPr>
+            <w:tcW w:type="dxa" w:w="9638"/>
+            <w:tcBorders>
+              <w:top w:val="single" w:color="E0E0E0" w:sz="4"/>
+              <w:left w:val="single" w:color="E0E0E0" w:sz="4"/>
+              <w:bottom w:val="single" w:color="E0E0E0" w:sz="4"/>
+              <w:right w:val="single" w:color="E0E0E0" w:sz="4"/>
+            </w:tcBorders>
+            <w:shd w:fill="FAFAFA" w:val="clear"/>
+            <w:tcMar>
+              <w:top w:type="dxa" w:w="60"/>
+              <w:left w:type="dxa" w:w="160"/>
+              <w:bottom w:type="dxa" w:w="60"/>
+              <w:right w:type="dxa" w:w="160"/>
+            </w:tcMar>
+          </w:tcPr>
+          <w:p>
+            <w:r>
+              <w:rPr>
+                <w:sz w:val="22"/>
+                <w:szCs w:val="22"/>
+              </w:rPr>
+              <w:t xml:space="preserve"/>
+            </w:r>
+          </w:p>
+        </w:tc>
+      </w:tr>
+      <w:tr>
+        <w:trPr>
+          <w:trHeight w:val="480"/>
+        </w:trPr>
+        <w:tc>
+          <w:tcPr>
+            <w:tcW w:type="dxa" w:w="9638"/>
+            <w:tcBorders>
+              <w:top w:val="single" w:color="E0E0E0" w:sz="4"/>
+              <w:left w:val="single" w:color="E0E0E0" w:sz="4"/>
+              <w:bottom w:val="single" w:color="E0E0E0" w:sz="4"/>
+              <w:right w:val="single" w:color="E0E0E0" w:sz="4"/>
+            </w:tcBorders>
+            <w:shd w:fill="FAFAFA" w:val="clear"/>
+            <w:tcMar>
+              <w:top w:type="dxa" w:w="60"/>
+              <w:left w:type="dxa" w:w="160"/>
+              <w:bottom w:type="dxa" w:w="60"/>
+              <w:right w:type="dxa" w:w="160"/>
+            </w:tcMar>
+          </w:tcPr>
+          <w:p>
+            <w:r>
+              <w:rPr>
+                <w:sz w:val="22"/>
+                <w:szCs w:val="22"/>
+              </w:rPr>
+              <w:t xml:space="preserve"/>
+            </w:r>
+          </w:p>
+        </w:tc>
+      </w:tr>
+      <w:tr>
+        <w:trPr>
+          <w:trHeight w:val="480"/>
+        </w:trPr>
+        <w:tc>
+          <w:tcPr>
+            <w:tcW w:type="dxa" w:w="9638"/>
+            <w:tcBorders>
+              <w:top w:val="single" w:color="E0E0E0" w:sz="4"/>
+              <w:left w:val="single" w:color="E0E0E0" w:sz="4"/>
+              <w:bottom w:val="single" w:color="E0E0E0" w:sz="4"/>
+              <w:right w:val="single" w:color="E0E0E0" w:sz="4"/>
+            </w:tcBorders>
+            <w:shd w:fill="FAFAFA" w:val="clear"/>
+            <w:tcMar>
+              <w:top w:type="dxa" w:w="60"/>
+              <w:left w:type="dxa" w:w="160"/>
+              <w:bottom w:type="dxa" w:w="60"/>
+              <w:right w:type="dxa" w:w="160"/>
+            </w:tcMar>
+          </w:tcPr>
+          <w:p>
+            <w:r>
+              <w:rPr>
+                <w:sz w:val="22"/>
+                <w:szCs w:val="22"/>
+              </w:rPr>
+              <w:t xml:space="preserve"/>
             </w:r>
           </w:p>
         </w:tc>
@@ -1061,8 +1020,13 @@
     </w:tbl>
     <w:p>
       <w:pPr>
-        <w:spacing w:after="160"/>
-      </w:pPr>
+        <w:spacing w:after="200"/>
+      </w:pPr>
+    </w:p>
+    <w:p>
+      <w:r>
+        <w:br w:type="page"/>
+      </w:r>
     </w:p>
     <w:p>
       <w:pPr>
@@ -1080,7 +1044,21 @@
           <w:sz w:val="24"/>
           <w:szCs w:val="24"/>
         </w:rPr>
-        <w:t xml:space="preserve">Despliega dos entornos con el mismo código</w:t>
+        <w:t xml:space="preserve">Paso 4 — Cambios que se hacen en el sitio y cambios que destruyen</w:t>
+      </w:r>
+    </w:p>
+    <w:p>
+      <w:pPr>
+        <w:spacing w:after="100"/>
+      </w:pPr>
+      <w:r>
+        <w:rPr>
+          <w:rFonts w:ascii="Arial" w:cs="Arial" w:eastAsia="Arial" w:hAnsi="Arial"/>
+          <w:color w:val="212121"/>
+          <w:sz w:val="22"/>
+          <w:szCs w:val="22"/>
+        </w:rPr>
+        <w:t xml:space="preserve">Tus predicciones, escritas antes de cada terraform plan: símbolo que esperas en la etiqueta nueva, qué dirá el segundo plan, y cuántos recursos afectará el cambio de rango y de qué manera.</w:t>
       </w:r>
     </w:p>
     <w:tbl>
@@ -1099,73 +1077,129 @@
         <w:gridCol w:w="9638"/>
       </w:tblGrid>
       <w:tr>
-        <w:tc>
-          <w:tcPr>
-            <w:tcW w:type="dxa" w:w="9638"/>
-            <w:tcBorders>
-              <w:top w:val="none" w:color="FFFFFF" w:sz="0"/>
-              <w:left w:val="none" w:color="FFFFFF" w:sz="0"/>
-              <w:bottom w:val="none" w:color="FFFFFF" w:sz="0"/>
-              <w:right w:val="none" w:color="FFFFFF" w:sz="0"/>
-            </w:tcBorders>
-            <w:shd w:fill="3949AB" w:val="clear"/>
-            <w:tcMar>
-              <w:top w:type="dxa" w:w="80"/>
-              <w:left w:type="dxa" w:w="160"/>
-              <w:bottom w:type="dxa" w:w="80"/>
-              <w:right w:type="dxa" w:w="160"/>
-            </w:tcMar>
-          </w:tcPr>
-          <w:p>
-            <w:r>
-              <w:rPr>
-                <w:rFonts w:ascii="Arial" w:cs="Arial" w:eastAsia="Arial" w:hAnsi="Arial"/>
-                <w:b/>
-                <w:bCs/>
-                <w:color w:val="FFFFFF"/>
-                <w:sz w:val="20"/>
-                <w:szCs w:val="20"/>
-              </w:rPr>
-              <w:t xml:space="preserve">📸 Los dos entornos desplegados y visibles en consola, sin conflicto de nombres ni de rangos</w:t>
-            </w:r>
-          </w:p>
-        </w:tc>
-      </w:tr>
-      <w:tr>
-        <w:trPr>
-          <w:trHeight w:val="2400"/>
-        </w:trPr>
-        <w:tc>
-          <w:tcPr>
-            <w:tcW w:type="dxa" w:w="9638"/>
-            <w:tcBorders>
-              <w:top w:val="single" w:color="E0E0E0" w:sz="4"/>
-              <w:left w:val="single" w:color="E0E0E0" w:sz="4"/>
-              <w:bottom w:val="single" w:color="E0E0E0" w:sz="4"/>
-              <w:right w:val="single" w:color="E0E0E0" w:sz="4"/>
-            </w:tcBorders>
-            <w:shd w:fill="FAFAFA" w:val="clear"/>
-            <w:tcMar>
-              <w:top w:type="dxa" w:w="80"/>
-              <w:left w:type="dxa" w:w="160"/>
-              <w:bottom w:type="dxa" w:w="80"/>
-              <w:right w:type="dxa" w:w="160"/>
-            </w:tcMar>
-          </w:tcPr>
-          <w:p>
-            <w:pPr>
-              <w:jc w:val="center"/>
-            </w:pPr>
-            <w:r>
-              <w:rPr>
-                <w:rFonts w:ascii="Arial" w:cs="Arial" w:eastAsia="Arial" w:hAnsi="Arial"/>
-                <w:i/>
-                <w:iCs/>
-                <w:color w:val="757575"/>
-                <w:sz w:val="20"/>
-                <w:szCs w:val="20"/>
-              </w:rPr>
-              <w:t xml:space="preserve">[Pega aquí la captura de pantalla]</w:t>
+        <w:trPr>
+          <w:trHeight w:val="480"/>
+        </w:trPr>
+        <w:tc>
+          <w:tcPr>
+            <w:tcW w:type="dxa" w:w="9638"/>
+            <w:tcBorders>
+              <w:top w:val="single" w:color="E0E0E0" w:sz="4"/>
+              <w:left w:val="single" w:color="E0E0E0" w:sz="4"/>
+              <w:bottom w:val="single" w:color="E0E0E0" w:sz="4"/>
+              <w:right w:val="single" w:color="E0E0E0" w:sz="4"/>
+            </w:tcBorders>
+            <w:shd w:fill="FAFAFA" w:val="clear"/>
+            <w:tcMar>
+              <w:top w:type="dxa" w:w="60"/>
+              <w:left w:type="dxa" w:w="160"/>
+              <w:bottom w:type="dxa" w:w="60"/>
+              <w:right w:type="dxa" w:w="160"/>
+            </w:tcMar>
+          </w:tcPr>
+          <w:p>
+            <w:r>
+              <w:rPr>
+                <w:sz w:val="22"/>
+                <w:szCs w:val="22"/>
+              </w:rPr>
+              <w:t xml:space="preserve"/>
+            </w:r>
+          </w:p>
+        </w:tc>
+      </w:tr>
+      <w:tr>
+        <w:trPr>
+          <w:trHeight w:val="480"/>
+        </w:trPr>
+        <w:tc>
+          <w:tcPr>
+            <w:tcW w:type="dxa" w:w="9638"/>
+            <w:tcBorders>
+              <w:top w:val="single" w:color="E0E0E0" w:sz="4"/>
+              <w:left w:val="single" w:color="E0E0E0" w:sz="4"/>
+              <w:bottom w:val="single" w:color="E0E0E0" w:sz="4"/>
+              <w:right w:val="single" w:color="E0E0E0" w:sz="4"/>
+            </w:tcBorders>
+            <w:shd w:fill="FAFAFA" w:val="clear"/>
+            <w:tcMar>
+              <w:top w:type="dxa" w:w="60"/>
+              <w:left w:type="dxa" w:w="160"/>
+              <w:bottom w:type="dxa" w:w="60"/>
+              <w:right w:type="dxa" w:w="160"/>
+            </w:tcMar>
+          </w:tcPr>
+          <w:p>
+            <w:r>
+              <w:rPr>
+                <w:sz w:val="22"/>
+                <w:szCs w:val="22"/>
+              </w:rPr>
+              <w:t xml:space="preserve"/>
+            </w:r>
+          </w:p>
+        </w:tc>
+      </w:tr>
+      <w:tr>
+        <w:trPr>
+          <w:trHeight w:val="480"/>
+        </w:trPr>
+        <w:tc>
+          <w:tcPr>
+            <w:tcW w:type="dxa" w:w="9638"/>
+            <w:tcBorders>
+              <w:top w:val="single" w:color="E0E0E0" w:sz="4"/>
+              <w:left w:val="single" w:color="E0E0E0" w:sz="4"/>
+              <w:bottom w:val="single" w:color="E0E0E0" w:sz="4"/>
+              <w:right w:val="single" w:color="E0E0E0" w:sz="4"/>
+            </w:tcBorders>
+            <w:shd w:fill="FAFAFA" w:val="clear"/>
+            <w:tcMar>
+              <w:top w:type="dxa" w:w="60"/>
+              <w:left w:type="dxa" w:w="160"/>
+              <w:bottom w:type="dxa" w:w="60"/>
+              <w:right w:type="dxa" w:w="160"/>
+            </w:tcMar>
+          </w:tcPr>
+          <w:p>
+            <w:r>
+              <w:rPr>
+                <w:sz w:val="22"/>
+                <w:szCs w:val="22"/>
+              </w:rPr>
+              <w:t xml:space="preserve"/>
+            </w:r>
+          </w:p>
+        </w:tc>
+      </w:tr>
+      <w:tr>
+        <w:trPr>
+          <w:trHeight w:val="480"/>
+        </w:trPr>
+        <w:tc>
+          <w:tcPr>
+            <w:tcW w:type="dxa" w:w="9638"/>
+            <w:tcBorders>
+              <w:top w:val="single" w:color="E0E0E0" w:sz="4"/>
+              <w:left w:val="single" w:color="E0E0E0" w:sz="4"/>
+              <w:bottom w:val="single" w:color="E0E0E0" w:sz="4"/>
+              <w:right w:val="single" w:color="E0E0E0" w:sz="4"/>
+            </w:tcBorders>
+            <w:shd w:fill="FAFAFA" w:val="clear"/>
+            <w:tcMar>
+              <w:top w:type="dxa" w:w="60"/>
+              <w:left w:type="dxa" w:w="160"/>
+              <w:bottom w:type="dxa" w:w="60"/>
+              <w:right w:type="dxa" w:w="160"/>
+            </w:tcMar>
+          </w:tcPr>
+          <w:p>
+            <w:r>
+              <w:rPr>
+                <w:sz w:val="22"/>
+                <w:szCs w:val="22"/>
+              </w:rPr>
+              <w:t xml:space="preserve"/>
             </w:r>
           </w:p>
         </w:tc>
@@ -1173,32 +1207,8 @@
     </w:tbl>
     <w:p>
       <w:pPr>
-        <w:spacing w:after="200"/>
-      </w:pPr>
-    </w:p>
-    <w:p>
-      <w:r>
-        <w:br w:type="page"/>
-      </w:r>
-    </w:p>
-    <w:p>
-      <w:pPr>
-        <w:pBdr>
-          <w:bottom w:val="single" w:color="FFA000" w:sz="4" w:space="1"/>
-        </w:pBdr>
-        <w:spacing w:after="120" w:before="240"/>
-      </w:pPr>
-      <w:r>
-        <w:rPr>
-          <w:rFonts w:ascii="Arial" w:cs="Arial" w:eastAsia="Arial" w:hAnsi="Arial"/>
-          <w:b/>
-          <w:bCs/>
-          <w:color w:val="3949AB"/>
-          <w:sz w:val="24"/>
-          <w:szCs w:val="24"/>
-        </w:rPr>
-        <w:t xml:space="preserve">Añade una instancia de prueba al módulo</w:t>
-      </w:r>
+        <w:spacing w:after="120"/>
+      </w:pPr>
     </w:p>
     <w:tbl>
       <w:tblPr>
@@ -1243,7 +1253,7 @@
                 <w:sz w:val="20"/>
                 <w:szCs w:val="20"/>
               </w:rPr>
-              <w:t xml:space="preserve">📸 La instancia EC2 de prueba desplegada por el módulo, con el servidor web arrancado por user_data</w:t>
+              <w:t xml:space="preserve">📸 El plan de la etiqueta nueva (con su símbolo), el plan sin cambios, y el resumen final del plan del cambio de rango de red</w:t>
             </w:r>
           </w:p>
         </w:tc>
@@ -1309,7 +1319,7 @@
           <w:sz w:val="24"/>
           <w:szCs w:val="24"/>
         </w:rPr>
-        <w:t xml:space="preserve">Cronometra destruir y reconstruir</w:t>
+        <w:t xml:space="preserve">Reflexiona (Paso 4)</w:t>
       </w:r>
     </w:p>
     <w:p>
@@ -1323,7 +1333,7 @@
           <w:sz w:val="22"/>
           <w:szCs w:val="22"/>
         </w:rPr>
-        <w:t xml:space="preserve">Tiempo real desde el primer comando de destrucción hasta que la infraestructura vuelve a estar disponible, comparado con tu estimación razonada de lo que costaría el montaje manual.</w:t>
+        <w:t xml:space="preserve">Si dentro de esa VPC hubiera una base de datos RDS, ¿qué habría pasado con sus datos al aplicar el tercer plan? ¿Qué te dice eso sobre leer el plan antes de aplicar?</w:t>
       </w:r>
     </w:p>
     <w:tbl>
@@ -1472,8 +1482,46 @@
     </w:tbl>
     <w:p>
       <w:pPr>
-        <w:spacing w:after="120"/>
-      </w:pPr>
+        <w:spacing w:after="200"/>
+      </w:pPr>
+    </w:p>
+    <w:p>
+      <w:r>
+        <w:br w:type="page"/>
+      </w:r>
+    </w:p>
+    <w:p>
+      <w:pPr>
+        <w:pBdr>
+          <w:bottom w:val="single" w:color="FFA000" w:sz="4" w:space="1"/>
+        </w:pBdr>
+        <w:spacing w:after="120" w:before="240"/>
+      </w:pPr>
+      <w:r>
+        <w:rPr>
+          <w:rFonts w:ascii="Arial" w:cs="Arial" w:eastAsia="Arial" w:hAnsi="Arial"/>
+          <w:b/>
+          <w:bCs/>
+          <w:color w:val="3949AB"/>
+          <w:sz w:val="24"/>
+          <w:szCs w:val="24"/>
+        </w:rPr>
+        <w:t xml:space="preserve">Paso 5 — Lo que Terraform no ve</w:t>
+      </w:r>
+    </w:p>
+    <w:p>
+      <w:pPr>
+        <w:spacing w:after="100"/>
+      </w:pPr>
+      <w:r>
+        <w:rPr>
+          <w:rFonts w:ascii="Arial" w:cs="Arial" w:eastAsia="Arial" w:hAnsi="Arial"/>
+          <w:color w:val="212121"/>
+          <w:sz w:val="22"/>
+          <w:szCs w:val="22"/>
+        </w:rPr>
+        <w:t xml:space="preserve">Tus predicciones: si el plan va a mencionar el grupo de seguridad creado a mano, y qué mostrará tras cambiar a mano el nombre de la VPC.</w:t>
+      </w:r>
     </w:p>
     <w:tbl>
       <w:tblPr>
@@ -1491,6 +1539,123 @@
         <w:gridCol w:w="9638"/>
       </w:tblGrid>
       <w:tr>
+        <w:trPr>
+          <w:trHeight w:val="480"/>
+        </w:trPr>
+        <w:tc>
+          <w:tcPr>
+            <w:tcW w:type="dxa" w:w="9638"/>
+            <w:tcBorders>
+              <w:top w:val="single" w:color="E0E0E0" w:sz="4"/>
+              <w:left w:val="single" w:color="E0E0E0" w:sz="4"/>
+              <w:bottom w:val="single" w:color="E0E0E0" w:sz="4"/>
+              <w:right w:val="single" w:color="E0E0E0" w:sz="4"/>
+            </w:tcBorders>
+            <w:shd w:fill="FAFAFA" w:val="clear"/>
+            <w:tcMar>
+              <w:top w:type="dxa" w:w="60"/>
+              <w:left w:type="dxa" w:w="160"/>
+              <w:bottom w:type="dxa" w:w="60"/>
+              <w:right w:type="dxa" w:w="160"/>
+            </w:tcMar>
+          </w:tcPr>
+          <w:p>
+            <w:r>
+              <w:rPr>
+                <w:sz w:val="22"/>
+                <w:szCs w:val="22"/>
+              </w:rPr>
+              <w:t xml:space="preserve"/>
+            </w:r>
+          </w:p>
+        </w:tc>
+      </w:tr>
+      <w:tr>
+        <w:trPr>
+          <w:trHeight w:val="480"/>
+        </w:trPr>
+        <w:tc>
+          <w:tcPr>
+            <w:tcW w:type="dxa" w:w="9638"/>
+            <w:tcBorders>
+              <w:top w:val="single" w:color="E0E0E0" w:sz="4"/>
+              <w:left w:val="single" w:color="E0E0E0" w:sz="4"/>
+              <w:bottom w:val="single" w:color="E0E0E0" w:sz="4"/>
+              <w:right w:val="single" w:color="E0E0E0" w:sz="4"/>
+            </w:tcBorders>
+            <w:shd w:fill="FAFAFA" w:val="clear"/>
+            <w:tcMar>
+              <w:top w:type="dxa" w:w="60"/>
+              <w:left w:type="dxa" w:w="160"/>
+              <w:bottom w:type="dxa" w:w="60"/>
+              <w:right w:type="dxa" w:w="160"/>
+            </w:tcMar>
+          </w:tcPr>
+          <w:p>
+            <w:r>
+              <w:rPr>
+                <w:sz w:val="22"/>
+                <w:szCs w:val="22"/>
+              </w:rPr>
+              <w:t xml:space="preserve"/>
+            </w:r>
+          </w:p>
+        </w:tc>
+      </w:tr>
+      <w:tr>
+        <w:trPr>
+          <w:trHeight w:val="480"/>
+        </w:trPr>
+        <w:tc>
+          <w:tcPr>
+            <w:tcW w:type="dxa" w:w="9638"/>
+            <w:tcBorders>
+              <w:top w:val="single" w:color="E0E0E0" w:sz="4"/>
+              <w:left w:val="single" w:color="E0E0E0" w:sz="4"/>
+              <w:bottom w:val="single" w:color="E0E0E0" w:sz="4"/>
+              <w:right w:val="single" w:color="E0E0E0" w:sz="4"/>
+            </w:tcBorders>
+            <w:shd w:fill="FAFAFA" w:val="clear"/>
+            <w:tcMar>
+              <w:top w:type="dxa" w:w="60"/>
+              <w:left w:type="dxa" w:w="160"/>
+              <w:bottom w:type="dxa" w:w="60"/>
+              <w:right w:type="dxa" w:w="160"/>
+            </w:tcMar>
+          </w:tcPr>
+          <w:p>
+            <w:r>
+              <w:rPr>
+                <w:sz w:val="22"/>
+                <w:szCs w:val="22"/>
+              </w:rPr>
+              <w:t xml:space="preserve"/>
+            </w:r>
+          </w:p>
+        </w:tc>
+      </w:tr>
+    </w:tbl>
+    <w:p>
+      <w:pPr>
+        <w:spacing w:after="120"/>
+      </w:pPr>
+    </w:p>
+    <w:tbl>
+      <w:tblPr>
+        <w:tblW w:type="dxa" w:w="9638"/>
+        <w:tblBorders>
+          <w:top w:val="single" w:color="auto" w:sz="4"/>
+          <w:left w:val="single" w:color="auto" w:sz="4"/>
+          <w:bottom w:val="single" w:color="auto" w:sz="4"/>
+          <w:right w:val="single" w:color="auto" w:sz="4"/>
+          <w:insideH w:val="single" w:color="auto" w:sz="4"/>
+          <w:insideV w:val="single" w:color="auto" w:sz="4"/>
+        </w:tblBorders>
+      </w:tblPr>
+      <w:tblGrid>
+        <w:gridCol w:w="9638"/>
+      </w:tblGrid>
+      <w:tr>
         <w:tc>
           <w:tcPr>
             <w:tcW w:type="dxa" w:w="9638"/>
@@ -1518,7 +1683,1113 @@
                 <w:sz w:val="20"/>
                 <w:szCs w:val="20"/>
               </w:rPr>
-              <w:t xml:space="preserve">📸 El cronómetro real de destruir/reconstruir</w:t>
+              <w:t xml:space="preserve">📸 Los dos planes, y la consola con el nombre de la VPC ya restaurado</w:t>
+            </w:r>
+          </w:p>
+        </w:tc>
+      </w:tr>
+      <w:tr>
+        <w:trPr>
+          <w:trHeight w:val="2400"/>
+        </w:trPr>
+        <w:tc>
+          <w:tcPr>
+            <w:tcW w:type="dxa" w:w="9638"/>
+            <w:tcBorders>
+              <w:top w:val="single" w:color="E0E0E0" w:sz="4"/>
+              <w:left w:val="single" w:color="E0E0E0" w:sz="4"/>
+              <w:bottom w:val="single" w:color="E0E0E0" w:sz="4"/>
+              <w:right w:val="single" w:color="E0E0E0" w:sz="4"/>
+            </w:tcBorders>
+            <w:shd w:fill="FAFAFA" w:val="clear"/>
+            <w:tcMar>
+              <w:top w:type="dxa" w:w="80"/>
+              <w:left w:type="dxa" w:w="160"/>
+              <w:bottom w:type="dxa" w:w="80"/>
+              <w:right w:type="dxa" w:w="160"/>
+            </w:tcMar>
+          </w:tcPr>
+          <w:p>
+            <w:pPr>
+              <w:jc w:val="center"/>
+            </w:pPr>
+            <w:r>
+              <w:rPr>
+                <w:rFonts w:ascii="Arial" w:cs="Arial" w:eastAsia="Arial" w:hAnsi="Arial"/>
+                <w:i/>
+                <w:iCs/>
+                <w:color w:val="757575"/>
+                <w:sz w:val="20"/>
+                <w:szCs w:val="20"/>
+              </w:rPr>
+              <w:t xml:space="preserve">[Pega aquí la captura de pantalla]</w:t>
+            </w:r>
+          </w:p>
+        </w:tc>
+      </w:tr>
+    </w:tbl>
+    <w:p>
+      <w:pPr>
+        <w:spacing w:after="160"/>
+      </w:pPr>
+    </w:p>
+    <w:p>
+      <w:pPr>
+        <w:pBdr>
+          <w:bottom w:val="single" w:color="FFA000" w:sz="4" w:space="1"/>
+        </w:pBdr>
+        <w:spacing w:after="120" w:before="240"/>
+      </w:pPr>
+      <w:r>
+        <w:rPr>
+          <w:rFonts w:ascii="Arial" w:cs="Arial" w:eastAsia="Arial" w:hAnsi="Arial"/>
+          <w:b/>
+          <w:bCs/>
+          <w:color w:val="3949AB"/>
+          <w:sz w:val="24"/>
+          <w:szCs w:val="24"/>
+        </w:rPr>
+        <w:t xml:space="preserve">Reflexiona (Paso 5)</w:t>
+      </w:r>
+    </w:p>
+    <w:p>
+      <w:pPr>
+        <w:spacing w:after="100"/>
+      </w:pPr>
+      <w:r>
+        <w:rPr>
+          <w:rFonts w:ascii="Arial" w:cs="Arial" w:eastAsia="Arial" w:hAnsi="Arial"/>
+          <w:color w:val="212121"/>
+          <w:sz w:val="22"/>
+          <w:szCs w:val="22"/>
+        </w:rPr>
+        <w:t xml:space="preserve">¿Qué pasará con la VPC al ejecutar terraform destroy si no has borrado antes grupo-a-mano? ¿Por qué Terraform no lo borra por su cuenta?</w:t>
+      </w:r>
+    </w:p>
+    <w:tbl>
+      <w:tblPr>
+        <w:tblW w:type="dxa" w:w="9638"/>
+        <w:tblBorders>
+          <w:top w:val="single" w:color="auto" w:sz="4"/>
+          <w:left w:val="single" w:color="auto" w:sz="4"/>
+          <w:bottom w:val="single" w:color="auto" w:sz="4"/>
+          <w:right w:val="single" w:color="auto" w:sz="4"/>
+          <w:insideH w:val="single" w:color="auto" w:sz="4"/>
+          <w:insideV w:val="single" w:color="auto" w:sz="4"/>
+        </w:tblBorders>
+      </w:tblPr>
+      <w:tblGrid>
+        <w:gridCol w:w="9638"/>
+      </w:tblGrid>
+      <w:tr>
+        <w:trPr>
+          <w:trHeight w:val="480"/>
+        </w:trPr>
+        <w:tc>
+          <w:tcPr>
+            <w:tcW w:type="dxa" w:w="9638"/>
+            <w:tcBorders>
+              <w:top w:val="single" w:color="E0E0E0" w:sz="4"/>
+              <w:left w:val="single" w:color="E0E0E0" w:sz="4"/>
+              <w:bottom w:val="single" w:color="E0E0E0" w:sz="4"/>
+              <w:right w:val="single" w:color="E0E0E0" w:sz="4"/>
+            </w:tcBorders>
+            <w:shd w:fill="FAFAFA" w:val="clear"/>
+            <w:tcMar>
+              <w:top w:type="dxa" w:w="60"/>
+              <w:left w:type="dxa" w:w="160"/>
+              <w:bottom w:type="dxa" w:w="60"/>
+              <w:right w:type="dxa" w:w="160"/>
+            </w:tcMar>
+          </w:tcPr>
+          <w:p>
+            <w:r>
+              <w:rPr>
+                <w:sz w:val="22"/>
+                <w:szCs w:val="22"/>
+              </w:rPr>
+              <w:t xml:space="preserve"/>
+            </w:r>
+          </w:p>
+        </w:tc>
+      </w:tr>
+      <w:tr>
+        <w:trPr>
+          <w:trHeight w:val="480"/>
+        </w:trPr>
+        <w:tc>
+          <w:tcPr>
+            <w:tcW w:type="dxa" w:w="9638"/>
+            <w:tcBorders>
+              <w:top w:val="single" w:color="E0E0E0" w:sz="4"/>
+              <w:left w:val="single" w:color="E0E0E0" w:sz="4"/>
+              <w:bottom w:val="single" w:color="E0E0E0" w:sz="4"/>
+              <w:right w:val="single" w:color="E0E0E0" w:sz="4"/>
+            </w:tcBorders>
+            <w:shd w:fill="FAFAFA" w:val="clear"/>
+            <w:tcMar>
+              <w:top w:type="dxa" w:w="60"/>
+              <w:left w:type="dxa" w:w="160"/>
+              <w:bottom w:type="dxa" w:w="60"/>
+              <w:right w:type="dxa" w:w="160"/>
+            </w:tcMar>
+          </w:tcPr>
+          <w:p>
+            <w:r>
+              <w:rPr>
+                <w:sz w:val="22"/>
+                <w:szCs w:val="22"/>
+              </w:rPr>
+              <w:t xml:space="preserve"/>
+            </w:r>
+          </w:p>
+        </w:tc>
+      </w:tr>
+      <w:tr>
+        <w:trPr>
+          <w:trHeight w:val="480"/>
+        </w:trPr>
+        <w:tc>
+          <w:tcPr>
+            <w:tcW w:type="dxa" w:w="9638"/>
+            <w:tcBorders>
+              <w:top w:val="single" w:color="E0E0E0" w:sz="4"/>
+              <w:left w:val="single" w:color="E0E0E0" w:sz="4"/>
+              <w:bottom w:val="single" w:color="E0E0E0" w:sz="4"/>
+              <w:right w:val="single" w:color="E0E0E0" w:sz="4"/>
+            </w:tcBorders>
+            <w:shd w:fill="FAFAFA" w:val="clear"/>
+            <w:tcMar>
+              <w:top w:type="dxa" w:w="60"/>
+              <w:left w:type="dxa" w:w="160"/>
+              <w:bottom w:type="dxa" w:w="60"/>
+              <w:right w:type="dxa" w:w="160"/>
+            </w:tcMar>
+          </w:tcPr>
+          <w:p>
+            <w:r>
+              <w:rPr>
+                <w:sz w:val="22"/>
+                <w:szCs w:val="22"/>
+              </w:rPr>
+              <w:t xml:space="preserve"/>
+            </w:r>
+          </w:p>
+        </w:tc>
+      </w:tr>
+      <w:tr>
+        <w:trPr>
+          <w:trHeight w:val="480"/>
+        </w:trPr>
+        <w:tc>
+          <w:tcPr>
+            <w:tcW w:type="dxa" w:w="9638"/>
+            <w:tcBorders>
+              <w:top w:val="single" w:color="E0E0E0" w:sz="4"/>
+              <w:left w:val="single" w:color="E0E0E0" w:sz="4"/>
+              <w:bottom w:val="single" w:color="E0E0E0" w:sz="4"/>
+              <w:right w:val="single" w:color="E0E0E0" w:sz="4"/>
+            </w:tcBorders>
+            <w:shd w:fill="FAFAFA" w:val="clear"/>
+            <w:tcMar>
+              <w:top w:type="dxa" w:w="60"/>
+              <w:left w:type="dxa" w:w="160"/>
+              <w:bottom w:type="dxa" w:w="60"/>
+              <w:right w:type="dxa" w:w="160"/>
+            </w:tcMar>
+          </w:tcPr>
+          <w:p>
+            <w:r>
+              <w:rPr>
+                <w:sz w:val="22"/>
+                <w:szCs w:val="22"/>
+              </w:rPr>
+              <w:t xml:space="preserve"/>
+            </w:r>
+          </w:p>
+        </w:tc>
+      </w:tr>
+    </w:tbl>
+    <w:p>
+      <w:pPr>
+        <w:spacing w:after="200"/>
+      </w:pPr>
+    </w:p>
+    <w:p>
+      <w:r>
+        <w:br w:type="page"/>
+      </w:r>
+    </w:p>
+    <w:p>
+      <w:pPr>
+        <w:shd w:fill="3949AB" w:val="clear"/>
+        <w:spacing w:after="0" w:before="320"/>
+        <w:ind w:left="200" w:right="200"/>
+      </w:pPr>
+      <w:r>
+        <w:rPr>
+          <w:rFonts w:ascii="Arial" w:cs="Arial" w:eastAsia="Arial" w:hAnsi="Arial"/>
+          <w:b/>
+          <w:bCs/>
+          <w:color w:val="FFFFFF"/>
+          <w:sz w:val="26"/>
+          <w:szCs w:val="26"/>
+        </w:rPr>
+        <w:t xml:space="preserve">Parte B — Reto: dos entornos, una instancia y un cronómetro</w:t>
+      </w:r>
+    </w:p>
+    <w:p>
+      <w:pPr>
+        <w:spacing w:after="120"/>
+      </w:pPr>
+    </w:p>
+    <w:p>
+      <w:pPr>
+        <w:pBdr>
+          <w:bottom w:val="single" w:color="FFA000" w:sz="4" w:space="1"/>
+        </w:pBdr>
+        <w:spacing w:after="120" w:before="240"/>
+      </w:pPr>
+      <w:r>
+        <w:rPr>
+          <w:rFonts w:ascii="Arial" w:cs="Arial" w:eastAsia="Arial" w:hAnsi="Arial"/>
+          <w:b/>
+          <w:bCs/>
+          <w:color w:val="3949AB"/>
+          <w:sz w:val="24"/>
+          <w:szCs w:val="24"/>
+        </w:rPr>
+        <w:t xml:space="preserve">Despliega dos entornos con el mismo código, a la vez</w:t>
+      </w:r>
+    </w:p>
+    <w:p>
+      <w:pPr>
+        <w:spacing w:after="100"/>
+      </w:pPr>
+      <w:r>
+        <w:rPr>
+          <w:rFonts w:ascii="Arial" w:cs="Arial" w:eastAsia="Arial" w:hAnsi="Arial"/>
+          <w:color w:val="212121"/>
+          <w:sz w:val="22"/>
+          <w:szCs w:val="22"/>
+        </w:rPr>
+        <w:t xml:space="preserve">Tu predicción de lo que hará terraform plan -var="environment=prod" en la carpeta donde ya tienes dev, y cómo has conseguido mantener los dos entornos separados (y por qué has elegido esa forma):</w:t>
+      </w:r>
+    </w:p>
+    <w:tbl>
+      <w:tblPr>
+        <w:tblW w:type="dxa" w:w="9638"/>
+        <w:tblBorders>
+          <w:top w:val="single" w:color="auto" w:sz="4"/>
+          <w:left w:val="single" w:color="auto" w:sz="4"/>
+          <w:bottom w:val="single" w:color="auto" w:sz="4"/>
+          <w:right w:val="single" w:color="auto" w:sz="4"/>
+          <w:insideH w:val="single" w:color="auto" w:sz="4"/>
+          <w:insideV w:val="single" w:color="auto" w:sz="4"/>
+        </w:tblBorders>
+      </w:tblPr>
+      <w:tblGrid>
+        <w:gridCol w:w="9638"/>
+      </w:tblGrid>
+      <w:tr>
+        <w:trPr>
+          <w:trHeight w:val="480"/>
+        </w:trPr>
+        <w:tc>
+          <w:tcPr>
+            <w:tcW w:type="dxa" w:w="9638"/>
+            <w:tcBorders>
+              <w:top w:val="single" w:color="E0E0E0" w:sz="4"/>
+              <w:left w:val="single" w:color="E0E0E0" w:sz="4"/>
+              <w:bottom w:val="single" w:color="E0E0E0" w:sz="4"/>
+              <w:right w:val="single" w:color="E0E0E0" w:sz="4"/>
+            </w:tcBorders>
+            <w:shd w:fill="FAFAFA" w:val="clear"/>
+            <w:tcMar>
+              <w:top w:type="dxa" w:w="60"/>
+              <w:left w:type="dxa" w:w="160"/>
+              <w:bottom w:type="dxa" w:w="60"/>
+              <w:right w:type="dxa" w:w="160"/>
+            </w:tcMar>
+          </w:tcPr>
+          <w:p>
+            <w:r>
+              <w:rPr>
+                <w:sz w:val="22"/>
+                <w:szCs w:val="22"/>
+              </w:rPr>
+              <w:t xml:space="preserve"/>
+            </w:r>
+          </w:p>
+        </w:tc>
+      </w:tr>
+      <w:tr>
+        <w:trPr>
+          <w:trHeight w:val="480"/>
+        </w:trPr>
+        <w:tc>
+          <w:tcPr>
+            <w:tcW w:type="dxa" w:w="9638"/>
+            <w:tcBorders>
+              <w:top w:val="single" w:color="E0E0E0" w:sz="4"/>
+              <w:left w:val="single" w:color="E0E0E0" w:sz="4"/>
+              <w:bottom w:val="single" w:color="E0E0E0" w:sz="4"/>
+              <w:right w:val="single" w:color="E0E0E0" w:sz="4"/>
+            </w:tcBorders>
+            <w:shd w:fill="FAFAFA" w:val="clear"/>
+            <w:tcMar>
+              <w:top w:type="dxa" w:w="60"/>
+              <w:left w:type="dxa" w:w="160"/>
+              <w:bottom w:type="dxa" w:w="60"/>
+              <w:right w:type="dxa" w:w="160"/>
+            </w:tcMar>
+          </w:tcPr>
+          <w:p>
+            <w:r>
+              <w:rPr>
+                <w:sz w:val="22"/>
+                <w:szCs w:val="22"/>
+              </w:rPr>
+              <w:t xml:space="preserve"/>
+            </w:r>
+          </w:p>
+        </w:tc>
+      </w:tr>
+      <w:tr>
+        <w:trPr>
+          <w:trHeight w:val="480"/>
+        </w:trPr>
+        <w:tc>
+          <w:tcPr>
+            <w:tcW w:type="dxa" w:w="9638"/>
+            <w:tcBorders>
+              <w:top w:val="single" w:color="E0E0E0" w:sz="4"/>
+              <w:left w:val="single" w:color="E0E0E0" w:sz="4"/>
+              <w:bottom w:val="single" w:color="E0E0E0" w:sz="4"/>
+              <w:right w:val="single" w:color="E0E0E0" w:sz="4"/>
+            </w:tcBorders>
+            <w:shd w:fill="FAFAFA" w:val="clear"/>
+            <w:tcMar>
+              <w:top w:type="dxa" w:w="60"/>
+              <w:left w:type="dxa" w:w="160"/>
+              <w:bottom w:type="dxa" w:w="60"/>
+              <w:right w:type="dxa" w:w="160"/>
+            </w:tcMar>
+          </w:tcPr>
+          <w:p>
+            <w:r>
+              <w:rPr>
+                <w:sz w:val="22"/>
+                <w:szCs w:val="22"/>
+              </w:rPr>
+              <w:t xml:space="preserve"/>
+            </w:r>
+          </w:p>
+        </w:tc>
+      </w:tr>
+      <w:tr>
+        <w:trPr>
+          <w:trHeight w:val="480"/>
+        </w:trPr>
+        <w:tc>
+          <w:tcPr>
+            <w:tcW w:type="dxa" w:w="9638"/>
+            <w:tcBorders>
+              <w:top w:val="single" w:color="E0E0E0" w:sz="4"/>
+              <w:left w:val="single" w:color="E0E0E0" w:sz="4"/>
+              <w:bottom w:val="single" w:color="E0E0E0" w:sz="4"/>
+              <w:right w:val="single" w:color="E0E0E0" w:sz="4"/>
+            </w:tcBorders>
+            <w:shd w:fill="FAFAFA" w:val="clear"/>
+            <w:tcMar>
+              <w:top w:type="dxa" w:w="60"/>
+              <w:left w:type="dxa" w:w="160"/>
+              <w:bottom w:type="dxa" w:w="60"/>
+              <w:right w:type="dxa" w:w="160"/>
+            </w:tcMar>
+          </w:tcPr>
+          <w:p>
+            <w:r>
+              <w:rPr>
+                <w:sz w:val="22"/>
+                <w:szCs w:val="22"/>
+              </w:rPr>
+              <w:t xml:space="preserve"/>
+            </w:r>
+          </w:p>
+        </w:tc>
+      </w:tr>
+      <w:tr>
+        <w:trPr>
+          <w:trHeight w:val="480"/>
+        </w:trPr>
+        <w:tc>
+          <w:tcPr>
+            <w:tcW w:type="dxa" w:w="9638"/>
+            <w:tcBorders>
+              <w:top w:val="single" w:color="E0E0E0" w:sz="4"/>
+              <w:left w:val="single" w:color="E0E0E0" w:sz="4"/>
+              <w:bottom w:val="single" w:color="E0E0E0" w:sz="4"/>
+              <w:right w:val="single" w:color="E0E0E0" w:sz="4"/>
+            </w:tcBorders>
+            <w:shd w:fill="FAFAFA" w:val="clear"/>
+            <w:tcMar>
+              <w:top w:type="dxa" w:w="60"/>
+              <w:left w:type="dxa" w:w="160"/>
+              <w:bottom w:type="dxa" w:w="60"/>
+              <w:right w:type="dxa" w:w="160"/>
+            </w:tcMar>
+          </w:tcPr>
+          <w:p>
+            <w:r>
+              <w:rPr>
+                <w:sz w:val="22"/>
+                <w:szCs w:val="22"/>
+              </w:rPr>
+              <w:t xml:space="preserve"/>
+            </w:r>
+          </w:p>
+        </w:tc>
+      </w:tr>
+    </w:tbl>
+    <w:p>
+      <w:pPr>
+        <w:spacing w:after="120"/>
+      </w:pPr>
+    </w:p>
+    <w:tbl>
+      <w:tblPr>
+        <w:tblW w:type="dxa" w:w="9638"/>
+        <w:tblBorders>
+          <w:top w:val="single" w:color="auto" w:sz="4"/>
+          <w:left w:val="single" w:color="auto" w:sz="4"/>
+          <w:bottom w:val="single" w:color="auto" w:sz="4"/>
+          <w:right w:val="single" w:color="auto" w:sz="4"/>
+          <w:insideH w:val="single" w:color="auto" w:sz="4"/>
+          <w:insideV w:val="single" w:color="auto" w:sz="4"/>
+        </w:tblBorders>
+      </w:tblPr>
+      <w:tblGrid>
+        <w:gridCol w:w="9638"/>
+      </w:tblGrid>
+      <w:tr>
+        <w:tc>
+          <w:tcPr>
+            <w:tcW w:type="dxa" w:w="9638"/>
+            <w:tcBorders>
+              <w:top w:val="none" w:color="FFFFFF" w:sz="0"/>
+              <w:left w:val="none" w:color="FFFFFF" w:sz="0"/>
+              <w:bottom w:val="none" w:color="FFFFFF" w:sz="0"/>
+              <w:right w:val="none" w:color="FFFFFF" w:sz="0"/>
+            </w:tcBorders>
+            <w:shd w:fill="3949AB" w:val="clear"/>
+            <w:tcMar>
+              <w:top w:type="dxa" w:w="80"/>
+              <w:left w:type="dxa" w:w="160"/>
+              <w:bottom w:type="dxa" w:w="80"/>
+              <w:right w:type="dxa" w:w="160"/>
+            </w:tcMar>
+          </w:tcPr>
+          <w:p>
+            <w:r>
+              <w:rPr>
+                <w:rFonts w:ascii="Arial" w:cs="Arial" w:eastAsia="Arial" w:hAnsi="Arial"/>
+                <w:b/>
+                <w:bCs/>
+                <w:color w:val="FFFFFF"/>
+                <w:sz w:val="20"/>
+                <w:szCs w:val="20"/>
+              </w:rPr>
+              <w:t xml:space="preserve">📸 El plan de la predicción, y los dos entornos desplegados y visibles en consola, cada uno con su rango</w:t>
+            </w:r>
+          </w:p>
+        </w:tc>
+      </w:tr>
+      <w:tr>
+        <w:trPr>
+          <w:trHeight w:val="2400"/>
+        </w:trPr>
+        <w:tc>
+          <w:tcPr>
+            <w:tcW w:type="dxa" w:w="9638"/>
+            <w:tcBorders>
+              <w:top w:val="single" w:color="E0E0E0" w:sz="4"/>
+              <w:left w:val="single" w:color="E0E0E0" w:sz="4"/>
+              <w:bottom w:val="single" w:color="E0E0E0" w:sz="4"/>
+              <w:right w:val="single" w:color="E0E0E0" w:sz="4"/>
+            </w:tcBorders>
+            <w:shd w:fill="FAFAFA" w:val="clear"/>
+            <w:tcMar>
+              <w:top w:type="dxa" w:w="80"/>
+              <w:left w:type="dxa" w:w="160"/>
+              <w:bottom w:type="dxa" w:w="80"/>
+              <w:right w:type="dxa" w:w="160"/>
+            </w:tcMar>
+          </w:tcPr>
+          <w:p>
+            <w:pPr>
+              <w:jc w:val="center"/>
+            </w:pPr>
+            <w:r>
+              <w:rPr>
+                <w:rFonts w:ascii="Arial" w:cs="Arial" w:eastAsia="Arial" w:hAnsi="Arial"/>
+                <w:i/>
+                <w:iCs/>
+                <w:color w:val="757575"/>
+                <w:sz w:val="20"/>
+                <w:szCs w:val="20"/>
+              </w:rPr>
+              <w:t xml:space="preserve">[Pega aquí la captura de pantalla]</w:t>
+            </w:r>
+          </w:p>
+        </w:tc>
+      </w:tr>
+    </w:tbl>
+    <w:p>
+      <w:pPr>
+        <w:spacing w:after="200"/>
+      </w:pPr>
+    </w:p>
+    <w:p>
+      <w:r>
+        <w:br w:type="page"/>
+      </w:r>
+    </w:p>
+    <w:p>
+      <w:pPr>
+        <w:pBdr>
+          <w:bottom w:val="single" w:color="FFA000" w:sz="4" w:space="1"/>
+        </w:pBdr>
+        <w:spacing w:after="120" w:before="240"/>
+      </w:pPr>
+      <w:r>
+        <w:rPr>
+          <w:rFonts w:ascii="Arial" w:cs="Arial" w:eastAsia="Arial" w:hAnsi="Arial"/>
+          <w:b/>
+          <w:bCs/>
+          <w:color w:val="3949AB"/>
+          <w:sz w:val="24"/>
+          <w:szCs w:val="24"/>
+        </w:rPr>
+        <w:t xml:space="preserve">Añade una instancia de prueba al módulo</w:t>
+      </w:r>
+    </w:p>
+    <w:p>
+      <w:pPr>
+        <w:spacing w:after="100"/>
+      </w:pPr>
+      <w:r>
+        <w:rPr>
+          <w:rFonts w:ascii="Arial" w:cs="Arial" w:eastAsia="Arial" w:hAnsi="Arial"/>
+          <w:color w:val="212121"/>
+          <w:sz w:val="22"/>
+          <w:szCs w:val="22"/>
+        </w:rPr>
+        <w:t xml:space="preserve">Cuántos recursos nuevos esperabas ver en el plan antes de aplicar:</w:t>
+      </w:r>
+    </w:p>
+    <w:tbl>
+      <w:tblPr>
+        <w:tblW w:type="dxa" w:w="9638"/>
+        <w:tblBorders>
+          <w:top w:val="single" w:color="auto" w:sz="4"/>
+          <w:left w:val="single" w:color="auto" w:sz="4"/>
+          <w:bottom w:val="single" w:color="auto" w:sz="4"/>
+          <w:right w:val="single" w:color="auto" w:sz="4"/>
+          <w:insideH w:val="single" w:color="auto" w:sz="4"/>
+          <w:insideV w:val="single" w:color="auto" w:sz="4"/>
+        </w:tblBorders>
+      </w:tblPr>
+      <w:tblGrid>
+        <w:gridCol w:w="9638"/>
+      </w:tblGrid>
+      <w:tr>
+        <w:trPr>
+          <w:trHeight w:val="480"/>
+        </w:trPr>
+        <w:tc>
+          <w:tcPr>
+            <w:tcW w:type="dxa" w:w="9638"/>
+            <w:tcBorders>
+              <w:top w:val="single" w:color="E0E0E0" w:sz="4"/>
+              <w:left w:val="single" w:color="E0E0E0" w:sz="4"/>
+              <w:bottom w:val="single" w:color="E0E0E0" w:sz="4"/>
+              <w:right w:val="single" w:color="E0E0E0" w:sz="4"/>
+            </w:tcBorders>
+            <w:shd w:fill="FAFAFA" w:val="clear"/>
+            <w:tcMar>
+              <w:top w:type="dxa" w:w="60"/>
+              <w:left w:type="dxa" w:w="160"/>
+              <w:bottom w:type="dxa" w:w="60"/>
+              <w:right w:type="dxa" w:w="160"/>
+            </w:tcMar>
+          </w:tcPr>
+          <w:p>
+            <w:r>
+              <w:rPr>
+                <w:sz w:val="22"/>
+                <w:szCs w:val="22"/>
+              </w:rPr>
+              <w:t xml:space="preserve"/>
+            </w:r>
+          </w:p>
+        </w:tc>
+      </w:tr>
+      <w:tr>
+        <w:trPr>
+          <w:trHeight w:val="480"/>
+        </w:trPr>
+        <w:tc>
+          <w:tcPr>
+            <w:tcW w:type="dxa" w:w="9638"/>
+            <w:tcBorders>
+              <w:top w:val="single" w:color="E0E0E0" w:sz="4"/>
+              <w:left w:val="single" w:color="E0E0E0" w:sz="4"/>
+              <w:bottom w:val="single" w:color="E0E0E0" w:sz="4"/>
+              <w:right w:val="single" w:color="E0E0E0" w:sz="4"/>
+            </w:tcBorders>
+            <w:shd w:fill="FAFAFA" w:val="clear"/>
+            <w:tcMar>
+              <w:top w:type="dxa" w:w="60"/>
+              <w:left w:type="dxa" w:w="160"/>
+              <w:bottom w:type="dxa" w:w="60"/>
+              <w:right w:type="dxa" w:w="160"/>
+            </w:tcMar>
+          </w:tcPr>
+          <w:p>
+            <w:r>
+              <w:rPr>
+                <w:sz w:val="22"/>
+                <w:szCs w:val="22"/>
+              </w:rPr>
+              <w:t xml:space="preserve"/>
+            </w:r>
+          </w:p>
+        </w:tc>
+      </w:tr>
+    </w:tbl>
+    <w:p>
+      <w:pPr>
+        <w:spacing w:after="120"/>
+      </w:pPr>
+    </w:p>
+    <w:tbl>
+      <w:tblPr>
+        <w:tblW w:type="dxa" w:w="9638"/>
+        <w:tblBorders>
+          <w:top w:val="single" w:color="auto" w:sz="4"/>
+          <w:left w:val="single" w:color="auto" w:sz="4"/>
+          <w:bottom w:val="single" w:color="auto" w:sz="4"/>
+          <w:right w:val="single" w:color="auto" w:sz="4"/>
+          <w:insideH w:val="single" w:color="auto" w:sz="4"/>
+          <w:insideV w:val="single" w:color="auto" w:sz="4"/>
+        </w:tblBorders>
+      </w:tblPr>
+      <w:tblGrid>
+        <w:gridCol w:w="9638"/>
+      </w:tblGrid>
+      <w:tr>
+        <w:tc>
+          <w:tcPr>
+            <w:tcW w:type="dxa" w:w="9638"/>
+            <w:tcBorders>
+              <w:top w:val="none" w:color="FFFFFF" w:sz="0"/>
+              <w:left w:val="none" w:color="FFFFFF" w:sz="0"/>
+              <w:bottom w:val="none" w:color="FFFFFF" w:sz="0"/>
+              <w:right w:val="none" w:color="FFFFFF" w:sz="0"/>
+            </w:tcBorders>
+            <w:shd w:fill="3949AB" w:val="clear"/>
+            <w:tcMar>
+              <w:top w:type="dxa" w:w="80"/>
+              <w:left w:type="dxa" w:w="160"/>
+              <w:bottom w:type="dxa" w:w="80"/>
+              <w:right w:type="dxa" w:w="160"/>
+            </w:tcMar>
+          </w:tcPr>
+          <w:p>
+            <w:r>
+              <w:rPr>
+                <w:rFonts w:ascii="Arial" w:cs="Arial" w:eastAsia="Arial" w:hAnsi="Arial"/>
+                <w:b/>
+                <w:bCs/>
+                <w:color w:val="FFFFFF"/>
+                <w:sz w:val="20"/>
+                <w:szCs w:val="20"/>
+              </w:rPr>
+              <w:t xml:space="preserve">📸 El código que has añadido al módulo</w:t>
+            </w:r>
+          </w:p>
+        </w:tc>
+      </w:tr>
+      <w:tr>
+        <w:trPr>
+          <w:trHeight w:val="2400"/>
+        </w:trPr>
+        <w:tc>
+          <w:tcPr>
+            <w:tcW w:type="dxa" w:w="9638"/>
+            <w:tcBorders>
+              <w:top w:val="single" w:color="E0E0E0" w:sz="4"/>
+              <w:left w:val="single" w:color="E0E0E0" w:sz="4"/>
+              <w:bottom w:val="single" w:color="E0E0E0" w:sz="4"/>
+              <w:right w:val="single" w:color="E0E0E0" w:sz="4"/>
+            </w:tcBorders>
+            <w:shd w:fill="FAFAFA" w:val="clear"/>
+            <w:tcMar>
+              <w:top w:type="dxa" w:w="80"/>
+              <w:left w:type="dxa" w:w="160"/>
+              <w:bottom w:type="dxa" w:w="80"/>
+              <w:right w:type="dxa" w:w="160"/>
+            </w:tcMar>
+          </w:tcPr>
+          <w:p>
+            <w:pPr>
+              <w:jc w:val="center"/>
+            </w:pPr>
+            <w:r>
+              <w:rPr>
+                <w:rFonts w:ascii="Arial" w:cs="Arial" w:eastAsia="Arial" w:hAnsi="Arial"/>
+                <w:i/>
+                <w:iCs/>
+                <w:color w:val="757575"/>
+                <w:sz w:val="20"/>
+                <w:szCs w:val="20"/>
+              </w:rPr>
+              <w:t xml:space="preserve">[Pega aquí la captura de pantalla]</w:t>
+            </w:r>
+          </w:p>
+        </w:tc>
+      </w:tr>
+    </w:tbl>
+    <w:p>
+      <w:pPr>
+        <w:spacing w:after="120"/>
+      </w:pPr>
+    </w:p>
+    <w:tbl>
+      <w:tblPr>
+        <w:tblW w:type="dxa" w:w="9638"/>
+        <w:tblBorders>
+          <w:top w:val="single" w:color="auto" w:sz="4"/>
+          <w:left w:val="single" w:color="auto" w:sz="4"/>
+          <w:bottom w:val="single" w:color="auto" w:sz="4"/>
+          <w:right w:val="single" w:color="auto" w:sz="4"/>
+          <w:insideH w:val="single" w:color="auto" w:sz="4"/>
+          <w:insideV w:val="single" w:color="auto" w:sz="4"/>
+        </w:tblBorders>
+      </w:tblPr>
+      <w:tblGrid>
+        <w:gridCol w:w="9638"/>
+      </w:tblGrid>
+      <w:tr>
+        <w:tc>
+          <w:tcPr>
+            <w:tcW w:type="dxa" w:w="9638"/>
+            <w:tcBorders>
+              <w:top w:val="none" w:color="FFFFFF" w:sz="0"/>
+              <w:left w:val="none" w:color="FFFFFF" w:sz="0"/>
+              <w:bottom w:val="none" w:color="FFFFFF" w:sz="0"/>
+              <w:right w:val="none" w:color="FFFFFF" w:sz="0"/>
+            </w:tcBorders>
+            <w:shd w:fill="3949AB" w:val="clear"/>
+            <w:tcMar>
+              <w:top w:type="dxa" w:w="80"/>
+              <w:left w:type="dxa" w:w="160"/>
+              <w:bottom w:type="dxa" w:w="80"/>
+              <w:right w:type="dxa" w:w="160"/>
+            </w:tcMar>
+          </w:tcPr>
+          <w:p>
+            <w:r>
+              <w:rPr>
+                <w:rFonts w:ascii="Arial" w:cs="Arial" w:eastAsia="Arial" w:hAnsi="Arial"/>
+                <w:b/>
+                <w:bCs/>
+                <w:color w:val="FFFFFF"/>
+                <w:sz w:val="20"/>
+                <w:szCs w:val="20"/>
+              </w:rPr>
+              <w:t xml:space="preserve">📸 La instancia de cada entorno respondiendo con su propia página (curl a la IP pública)</w:t>
+            </w:r>
+          </w:p>
+        </w:tc>
+      </w:tr>
+      <w:tr>
+        <w:trPr>
+          <w:trHeight w:val="2400"/>
+        </w:trPr>
+        <w:tc>
+          <w:tcPr>
+            <w:tcW w:type="dxa" w:w="9638"/>
+            <w:tcBorders>
+              <w:top w:val="single" w:color="E0E0E0" w:sz="4"/>
+              <w:left w:val="single" w:color="E0E0E0" w:sz="4"/>
+              <w:bottom w:val="single" w:color="E0E0E0" w:sz="4"/>
+              <w:right w:val="single" w:color="E0E0E0" w:sz="4"/>
+            </w:tcBorders>
+            <w:shd w:fill="FAFAFA" w:val="clear"/>
+            <w:tcMar>
+              <w:top w:type="dxa" w:w="80"/>
+              <w:left w:type="dxa" w:w="160"/>
+              <w:bottom w:type="dxa" w:w="80"/>
+              <w:right w:type="dxa" w:w="160"/>
+            </w:tcMar>
+          </w:tcPr>
+          <w:p>
+            <w:pPr>
+              <w:jc w:val="center"/>
+            </w:pPr>
+            <w:r>
+              <w:rPr>
+                <w:rFonts w:ascii="Arial" w:cs="Arial" w:eastAsia="Arial" w:hAnsi="Arial"/>
+                <w:i/>
+                <w:iCs/>
+                <w:color w:val="757575"/>
+                <w:sz w:val="20"/>
+                <w:szCs w:val="20"/>
+              </w:rPr>
+              <w:t xml:space="preserve">[Pega aquí la captura de pantalla]</w:t>
+            </w:r>
+          </w:p>
+        </w:tc>
+      </w:tr>
+    </w:tbl>
+    <w:p>
+      <w:pPr>
+        <w:spacing w:after="200"/>
+      </w:pPr>
+    </w:p>
+    <w:p>
+      <w:r>
+        <w:br w:type="page"/>
+      </w:r>
+    </w:p>
+    <w:p>
+      <w:pPr>
+        <w:pBdr>
+          <w:bottom w:val="single" w:color="FFA000" w:sz="4" w:space="1"/>
+        </w:pBdr>
+        <w:spacing w:after="120" w:before="240"/>
+      </w:pPr>
+      <w:r>
+        <w:rPr>
+          <w:rFonts w:ascii="Arial" w:cs="Arial" w:eastAsia="Arial" w:hAnsi="Arial"/>
+          <w:b/>
+          <w:bCs/>
+          <w:color w:val="3949AB"/>
+          <w:sz w:val="24"/>
+          <w:szCs w:val="24"/>
+        </w:rPr>
+        <w:t xml:space="preserve">Cronometra destruir y reconstruir</w:t>
+      </w:r>
+    </w:p>
+    <w:p>
+      <w:pPr>
+        <w:spacing w:after="100"/>
+      </w:pPr>
+      <w:r>
+        <w:rPr>
+          <w:rFonts w:ascii="Arial" w:cs="Arial" w:eastAsia="Arial" w:hAnsi="Arial"/>
+          <w:color w:val="212121"/>
+          <w:sz w:val="22"/>
+          <w:szCs w:val="22"/>
+        </w:rPr>
+        <w:t xml:space="preserve">Tiempo real desde el primer comando de destrucción hasta que la instancia vuelve a responder, comparado con tu estimación razonada de lo que costaría el montaje manual.</w:t>
+      </w:r>
+    </w:p>
+    <w:tbl>
+      <w:tblPr>
+        <w:tblW w:type="dxa" w:w="9638"/>
+        <w:tblBorders>
+          <w:top w:val="single" w:color="auto" w:sz="4"/>
+          <w:left w:val="single" w:color="auto" w:sz="4"/>
+          <w:bottom w:val="single" w:color="auto" w:sz="4"/>
+          <w:right w:val="single" w:color="auto" w:sz="4"/>
+          <w:insideH w:val="single" w:color="auto" w:sz="4"/>
+          <w:insideV w:val="single" w:color="auto" w:sz="4"/>
+        </w:tblBorders>
+      </w:tblPr>
+      <w:tblGrid>
+        <w:gridCol w:w="9638"/>
+      </w:tblGrid>
+      <w:tr>
+        <w:trPr>
+          <w:trHeight w:val="480"/>
+        </w:trPr>
+        <w:tc>
+          <w:tcPr>
+            <w:tcW w:type="dxa" w:w="9638"/>
+            <w:tcBorders>
+              <w:top w:val="single" w:color="E0E0E0" w:sz="4"/>
+              <w:left w:val="single" w:color="E0E0E0" w:sz="4"/>
+              <w:bottom w:val="single" w:color="E0E0E0" w:sz="4"/>
+              <w:right w:val="single" w:color="E0E0E0" w:sz="4"/>
+            </w:tcBorders>
+            <w:shd w:fill="FAFAFA" w:val="clear"/>
+            <w:tcMar>
+              <w:top w:type="dxa" w:w="60"/>
+              <w:left w:type="dxa" w:w="160"/>
+              <w:bottom w:type="dxa" w:w="60"/>
+              <w:right w:type="dxa" w:w="160"/>
+            </w:tcMar>
+          </w:tcPr>
+          <w:p>
+            <w:r>
+              <w:rPr>
+                <w:sz w:val="22"/>
+                <w:szCs w:val="22"/>
+              </w:rPr>
+              <w:t xml:space="preserve"/>
+            </w:r>
+          </w:p>
+        </w:tc>
+      </w:tr>
+      <w:tr>
+        <w:trPr>
+          <w:trHeight w:val="480"/>
+        </w:trPr>
+        <w:tc>
+          <w:tcPr>
+            <w:tcW w:type="dxa" w:w="9638"/>
+            <w:tcBorders>
+              <w:top w:val="single" w:color="E0E0E0" w:sz="4"/>
+              <w:left w:val="single" w:color="E0E0E0" w:sz="4"/>
+              <w:bottom w:val="single" w:color="E0E0E0" w:sz="4"/>
+              <w:right w:val="single" w:color="E0E0E0" w:sz="4"/>
+            </w:tcBorders>
+            <w:shd w:fill="FAFAFA" w:val="clear"/>
+            <w:tcMar>
+              <w:top w:type="dxa" w:w="60"/>
+              <w:left w:type="dxa" w:w="160"/>
+              <w:bottom w:type="dxa" w:w="60"/>
+              <w:right w:type="dxa" w:w="160"/>
+            </w:tcMar>
+          </w:tcPr>
+          <w:p>
+            <w:r>
+              <w:rPr>
+                <w:sz w:val="22"/>
+                <w:szCs w:val="22"/>
+              </w:rPr>
+              <w:t xml:space="preserve"/>
+            </w:r>
+          </w:p>
+        </w:tc>
+      </w:tr>
+      <w:tr>
+        <w:trPr>
+          <w:trHeight w:val="480"/>
+        </w:trPr>
+        <w:tc>
+          <w:tcPr>
+            <w:tcW w:type="dxa" w:w="9638"/>
+            <w:tcBorders>
+              <w:top w:val="single" w:color="E0E0E0" w:sz="4"/>
+              <w:left w:val="single" w:color="E0E0E0" w:sz="4"/>
+              <w:bottom w:val="single" w:color="E0E0E0" w:sz="4"/>
+              <w:right w:val="single" w:color="E0E0E0" w:sz="4"/>
+            </w:tcBorders>
+            <w:shd w:fill="FAFAFA" w:val="clear"/>
+            <w:tcMar>
+              <w:top w:type="dxa" w:w="60"/>
+              <w:left w:type="dxa" w:w="160"/>
+              <w:bottom w:type="dxa" w:w="60"/>
+              <w:right w:type="dxa" w:w="160"/>
+            </w:tcMar>
+          </w:tcPr>
+          <w:p>
+            <w:r>
+              <w:rPr>
+                <w:sz w:val="22"/>
+                <w:szCs w:val="22"/>
+              </w:rPr>
+              <w:t xml:space="preserve"/>
+            </w:r>
+          </w:p>
+        </w:tc>
+      </w:tr>
+      <w:tr>
+        <w:trPr>
+          <w:trHeight w:val="480"/>
+        </w:trPr>
+        <w:tc>
+          <w:tcPr>
+            <w:tcW w:type="dxa" w:w="9638"/>
+            <w:tcBorders>
+              <w:top w:val="single" w:color="E0E0E0" w:sz="4"/>
+              <w:left w:val="single" w:color="E0E0E0" w:sz="4"/>
+              <w:bottom w:val="single" w:color="E0E0E0" w:sz="4"/>
+              <w:right w:val="single" w:color="E0E0E0" w:sz="4"/>
+            </w:tcBorders>
+            <w:shd w:fill="FAFAFA" w:val="clear"/>
+            <w:tcMar>
+              <w:top w:type="dxa" w:w="60"/>
+              <w:left w:type="dxa" w:w="160"/>
+              <w:bottom w:type="dxa" w:w="60"/>
+              <w:right w:type="dxa" w:w="160"/>
+            </w:tcMar>
+          </w:tcPr>
+          <w:p>
+            <w:r>
+              <w:rPr>
+                <w:sz w:val="22"/>
+                <w:szCs w:val="22"/>
+              </w:rPr>
+              <w:t xml:space="preserve"/>
+            </w:r>
+          </w:p>
+        </w:tc>
+      </w:tr>
+    </w:tbl>
+    <w:p>
+      <w:pPr>
+        <w:spacing w:after="120"/>
+      </w:pPr>
+    </w:p>
+    <w:tbl>
+      <w:tblPr>
+        <w:tblW w:type="dxa" w:w="9638"/>
+        <w:tblBorders>
+          <w:top w:val="single" w:color="auto" w:sz="4"/>
+          <w:left w:val="single" w:color="auto" w:sz="4"/>
+          <w:bottom w:val="single" w:color="auto" w:sz="4"/>
+          <w:right w:val="single" w:color="auto" w:sz="4"/>
+          <w:insideH w:val="single" w:color="auto" w:sz="4"/>
+          <w:insideV w:val="single" w:color="auto" w:sz="4"/>
+        </w:tblBorders>
+      </w:tblPr>
+      <w:tblGrid>
+        <w:gridCol w:w="9638"/>
+      </w:tblGrid>
+      <w:tr>
+        <w:tc>
+          <w:tcPr>
+            <w:tcW w:type="dxa" w:w="9638"/>
+            <w:tcBorders>
+              <w:top w:val="none" w:color="FFFFFF" w:sz="0"/>
+              <w:left w:val="none" w:color="FFFFFF" w:sz="0"/>
+              <w:bottom w:val="none" w:color="FFFFFF" w:sz="0"/>
+              <w:right w:val="none" w:color="FFFFFF" w:sz="0"/>
+            </w:tcBorders>
+            <w:shd w:fill="3949AB" w:val="clear"/>
+            <w:tcMar>
+              <w:top w:type="dxa" w:w="80"/>
+              <w:left w:type="dxa" w:w="160"/>
+              <w:bottom w:type="dxa" w:w="80"/>
+              <w:right w:type="dxa" w:w="160"/>
+            </w:tcMar>
+          </w:tcPr>
+          <w:p>
+            <w:r>
+              <w:rPr>
+                <w:rFonts w:ascii="Arial" w:cs="Arial" w:eastAsia="Arial" w:hAnsi="Arial"/>
+                <w:b/>
+                <w:bCs/>
+                <w:color w:val="FFFFFF"/>
+                <w:sz w:val="20"/>
+                <w:szCs w:val="20"/>
+              </w:rPr>
+              <w:t xml:space="preserve">📸 El cronómetro real de destruir/reconstruir, y la comprobación de que no queda ningún recurso huérfano</w:t>
             </w:r>
           </w:p>
         </w:tc>

</xml_diff>